<commit_message>
docs: refine Korean portfolio review package
</commit_message>
<xml_diff>
--- a/docs/adinsight_portfolio_submission_ko.docx
+++ b/docs/adinsight_portfolio_submission_ko.docx
@@ -2,7 +2,7 @@
 <file path=word/document.xml><?xml version="1.0" encoding="utf-8"?>
 <w:document xmlns:w="http://schemas.openxmlformats.org/wordprocessingml/2006/main" xmlns:m="http://schemas.openxmlformats.org/officeDocument/2006/math" xmlns:r="http://schemas.openxmlformats.org/officeDocument/2006/relationships" xmlns:o="urn:schemas-microsoft-com:office:office" xmlns:v="urn:schemas-microsoft-com:vml" xmlns:w10="urn:schemas-microsoft-com:office:word" xmlns:a="http://schemas.openxmlformats.org/drawingml/2006/main" xmlns:pic="http://schemas.openxmlformats.org/drawingml/2006/picture" xmlns:wp="http://schemas.openxmlformats.org/drawingml/2006/wordprocessingDrawing">
   <w:body>
-    <w:bookmarkStart w:id="32" w:name="X4339d66b79b67fa327a62d065c4ff7c25a27d36"/>
+    <w:bookmarkStart w:id="36" w:name="X4339d66b79b67fa327a62d065c4ff7c25a27d36"/>
     <w:p>
       <w:pPr>
         <w:pStyle w:val="Heading1"/>
@@ -92,7 +92,322 @@
         </w:pict>
       </w:r>
     </w:p>
-    <w:bookmarkStart w:id="9" w:name="제출-패키지"/>
+    <w:bookmarkStart w:id="9" w:name="초-요약"/>
+    <w:p>
+      <w:pPr>
+        <w:pStyle w:val="Heading2"/>
+      </w:pPr>
+      <w:r>
+        <w:t xml:space="preserve">0. 30초 요약</w:t>
+      </w:r>
+    </w:p>
+    <w:tbl>
+      <w:tblPr>
+        <w:tblStyle w:val="Table"/>
+        <w:tblW w:type="pct" w:w="5000"/>
+        <w:tblLayout w:type="fixed"/>
+        <w:tblLook w:firstRow="1" w:lastRow="0" w:firstColumn="0" w:lastColumn="0" w:noHBand="0" w:noVBand="0" w:val="0020"/>
+      </w:tblPr>
+      <w:tblGrid>
+        <w:gridCol w:w="3960"/>
+        <w:gridCol w:w="3960"/>
+      </w:tblGrid>
+      <w:tr>
+        <w:trPr>
+          <w:tblHeader w:val="on"/>
+        </w:trPr>
+        <w:tc>
+          <w:tcPr/>
+          <w:p>
+            <w:pPr>
+              <w:pStyle w:val="Compact"/>
+            </w:pPr>
+            <w:r>
+              <w:t xml:space="preserve">항목</w:t>
+            </w:r>
+          </w:p>
+        </w:tc>
+        <w:tc>
+          <w:tcPr/>
+          <w:p>
+            <w:pPr>
+              <w:pStyle w:val="Compact"/>
+            </w:pPr>
+            <w:r>
+              <w:t xml:space="preserve">내용</w:t>
+            </w:r>
+          </w:p>
+        </w:tc>
+      </w:tr>
+      <w:tr>
+        <w:tc>
+          <w:tcPr/>
+          <w:p>
+            <w:pPr>
+              <w:pStyle w:val="Compact"/>
+            </w:pPr>
+            <w:r>
+              <w:t xml:space="preserve">프로젝트 기간</w:t>
+            </w:r>
+          </w:p>
+        </w:tc>
+        <w:tc>
+          <w:tcPr/>
+          <w:p>
+            <w:pPr>
+              <w:pStyle w:val="Compact"/>
+            </w:pPr>
+            <w:r>
+              <w:t xml:space="preserve">2026.04 - 2026.07</w:t>
+            </w:r>
+          </w:p>
+        </w:tc>
+      </w:tr>
+      <w:tr>
+        <w:tc>
+          <w:tcPr/>
+          <w:p>
+            <w:pPr>
+              <w:pStyle w:val="Compact"/>
+            </w:pPr>
+            <w:r>
+              <w:t xml:space="preserve">프로젝트 형태</w:t>
+            </w:r>
+          </w:p>
+        </w:tc>
+        <w:tc>
+          <w:tcPr/>
+          <w:p>
+            <w:pPr>
+              <w:pStyle w:val="Compact"/>
+            </w:pPr>
+            <w:r>
+              <w:t xml:space="preserve">처음부터 끝까지 혼자 진행한 개인 포트폴리오 프로젝트</w:t>
+            </w:r>
+          </w:p>
+        </w:tc>
+      </w:tr>
+      <w:tr>
+        <w:tc>
+          <w:tcPr/>
+          <w:p>
+            <w:pPr>
+              <w:pStyle w:val="Compact"/>
+            </w:pPr>
+            <w:r>
+              <w:t xml:space="preserve">담당 범위</w:t>
+            </w:r>
+          </w:p>
+        </w:tc>
+        <w:tc>
+          <w:tcPr/>
+          <w:p>
+            <w:pPr>
+              <w:pStyle w:val="Compact"/>
+            </w:pPr>
+            <w:r>
+              <w:t xml:space="preserve">데이터 수집, raw schema, dbt 모델링, Airflow DAG, Superset dashboard, ROAS model comparison, FastAPI serving, Text2SQL validator/gateway/eval, CI, 제출 문서화</w:t>
+            </w:r>
+          </w:p>
+        </w:tc>
+      </w:tr>
+      <w:tr>
+        <w:tc>
+          <w:tcPr/>
+          <w:p>
+            <w:pPr>
+              <w:pStyle w:val="Compact"/>
+            </w:pPr>
+            <w:r>
+              <w:t xml:space="preserve">핵심 기술</w:t>
+            </w:r>
+          </w:p>
+        </w:tc>
+        <w:tc>
+          <w:tcPr/>
+          <w:p>
+            <w:pPr>
+              <w:pStyle w:val="Compact"/>
+            </w:pPr>
+            <w:r>
+              <w:t xml:space="preserve">Python, SQL, Airflow, PostgreSQL, dbt, Superset, FastAPI, GitHub Actions, OpenAI/Gemini gateway</w:t>
+            </w:r>
+          </w:p>
+        </w:tc>
+      </w:tr>
+      <w:tr>
+        <w:tc>
+          <w:tcPr/>
+          <w:p>
+            <w:pPr>
+              <w:pStyle w:val="Compact"/>
+            </w:pPr>
+            <w:r>
+              <w:t xml:space="preserve">핵심 성과 1</w:t>
+            </w:r>
+          </w:p>
+        </w:tc>
+        <w:tc>
+          <w:tcPr/>
+          <w:p>
+            <w:pPr>
+              <w:pStyle w:val="Compact"/>
+            </w:pPr>
+            <w:r>
+              <w:t xml:space="preserve">Airflow daily adaptive run 1회에서</w:t>
+            </w:r>
+            <w:r>
+              <w:t xml:space="preserve"> </w:t>
+            </w:r>
+            <w:r>
+              <w:rPr>
+                <w:rStyle w:val="VerbatimChar"/>
+              </w:rPr>
+              <w:t xml:space="preserve">1,725</w:t>
+            </w:r>
+            <w:r>
+              <w:t xml:space="preserve">건 수집,</w:t>
+            </w:r>
+            <w:r>
+              <w:t xml:space="preserve"> </w:t>
+            </w:r>
+            <w:r>
+              <w:rPr>
+                <w:rStyle w:val="VerbatimChar"/>
+              </w:rPr>
+              <w:t xml:space="preserve">1,410</w:t>
+            </w:r>
+            <w:r>
+              <w:t xml:space="preserve">건 신규 적재</w:t>
+            </w:r>
+          </w:p>
+        </w:tc>
+      </w:tr>
+      <w:tr>
+        <w:tc>
+          <w:tcPr/>
+          <w:p>
+            <w:pPr>
+              <w:pStyle w:val="Compact"/>
+            </w:pPr>
+            <w:r>
+              <w:t xml:space="preserve">핵심 성과 2</w:t>
+            </w:r>
+          </w:p>
+        </w:tc>
+        <w:tc>
+          <w:tcPr/>
+          <w:p>
+            <w:pPr>
+              <w:pStyle w:val="Compact"/>
+            </w:pPr>
+            <w:r>
+              <w:t xml:space="preserve">ROAS benchmark model MAE를 baseline</w:t>
+            </w:r>
+            <w:r>
+              <w:t xml:space="preserve"> </w:t>
+            </w:r>
+            <w:r>
+              <w:rPr>
+                <w:rStyle w:val="VerbatimChar"/>
+              </w:rPr>
+              <w:t xml:space="preserve">0.0892</w:t>
+            </w:r>
+            <w:r>
+              <w:t xml:space="preserve">에서 linear model</w:t>
+            </w:r>
+            <w:r>
+              <w:t xml:space="preserve"> </w:t>
+            </w:r>
+            <w:r>
+              <w:rPr>
+                <w:rStyle w:val="VerbatimChar"/>
+              </w:rPr>
+              <w:t xml:space="preserve">0.0474</w:t>
+            </w:r>
+            <w:r>
+              <w:t xml:space="preserve">로 개선하고 FastAPI artifact serving 구현</w:t>
+            </w:r>
+          </w:p>
+        </w:tc>
+      </w:tr>
+      <w:tr>
+        <w:tc>
+          <w:tcPr/>
+          <w:p>
+            <w:pPr>
+              <w:pStyle w:val="Compact"/>
+            </w:pPr>
+            <w:r>
+              <w:t xml:space="preserve">핵심 성과 3</w:t>
+            </w:r>
+          </w:p>
+        </w:tc>
+        <w:tc>
+          <w:tcPr/>
+          <w:p>
+            <w:pPr>
+              <w:pStyle w:val="Compact"/>
+            </w:pPr>
+            <w:r>
+              <w:t xml:space="preserve">Text2SQL v2에 SQL validator, timeout, audit, provider fallback을 붙이고 OpenAI</w:t>
+            </w:r>
+            <w:r>
+              <w:t xml:space="preserve"> </w:t>
+            </w:r>
+            <w:r>
+              <w:rPr>
+                <w:rStyle w:val="VerbatimChar"/>
+              </w:rPr>
+              <w:t xml:space="preserve">24/24 + 14/14</w:t>
+            </w:r>
+            <w:r>
+              <w:t xml:space="preserve">, Gemini</w:t>
+            </w:r>
+            <w:r>
+              <w:t xml:space="preserve"> </w:t>
+            </w:r>
+            <w:r>
+              <w:rPr>
+                <w:rStyle w:val="VerbatimChar"/>
+              </w:rPr>
+              <w:t xml:space="preserve">24/24 + 12/14</w:t>
+            </w:r>
+            <w:r>
+              <w:t xml:space="preserve"> </w:t>
+            </w:r>
+            <w:r>
+              <w:t xml:space="preserve">eval 결과 확보</w:t>
+            </w:r>
+          </w:p>
+        </w:tc>
+      </w:tr>
+    </w:tbl>
+    <w:p>
+      <w:pPr>
+        <w:pStyle w:val="BodyText"/>
+      </w:pPr>
+      <w:r>
+        <w:t xml:space="preserve">한 줄 요약:</w:t>
+      </w:r>
+    </w:p>
+    <w:p>
+      <w:pPr>
+        <w:pStyle w:val="BlockText"/>
+      </w:pPr>
+      <w:r>
+        <w:t xml:space="preserve">인플루언서 광고 수집 데이터를 결제 전환과 campaign ROI 관점으로 모델링하고, Airflow/dbt 기반 데이터 파이프라인부터 Superset, FastAPI, Text2SQL gateway까지 연결한 개인 데이터 엔지니어링 프로젝트입니다.</w:t>
+      </w:r>
+    </w:p>
+    <w:p>
+      <w:r>
+        <w:pict>
+          <v:rect style="width:0;height:1.5pt" o:hralign="center" o:hrstd="t" o:hr="t"/>
+        </w:pict>
+      </w:r>
+    </w:p>
+    <w:bookmarkEnd w:id="9"/>
+    <w:bookmarkStart w:id="10" w:name="제출-패키지"/>
     <w:p>
       <w:pPr>
         <w:pStyle w:val="Heading2"/>
@@ -467,8 +782,8 @@
         </w:pict>
       </w:r>
     </w:p>
-    <w:bookmarkEnd w:id="9"/>
-    <w:bookmarkStart w:id="10" w:name="프로젝트-한-줄-소개"/>
+    <w:bookmarkEnd w:id="10"/>
+    <w:bookmarkStart w:id="11" w:name="프로젝트-한-줄-소개"/>
     <w:p>
       <w:pPr>
         <w:pStyle w:val="Heading2"/>
@@ -497,6 +812,27 @@
         <w:pStyle w:val="BodyText"/>
       </w:pPr>
       <w:r>
+        <w:t xml:space="preserve">이 프로젝트는 팀 프로젝트가 아니라</w:t>
+      </w:r>
+      <w:r>
+        <w:t xml:space="preserve"> </w:t>
+      </w:r>
+      <w:r>
+        <w:rPr>
+          <w:b/>
+          <w:bCs/>
+        </w:rPr>
+        <w:t xml:space="preserve">기획, 설계, 구현, 검증, 문서화까지 처음부터 끝까지 혼자 진행한 개인 프로젝트</w:t>
+      </w:r>
+      <w:r>
+        <w:t xml:space="preserve">입니다. 따라서 아래 산출물의 담당 범위는 별도 표기가 없는 한 모두 본인이 직접 수행한 범위입니다.</w:t>
+      </w:r>
+    </w:p>
+    <w:p>
+      <w:pPr>
+        <w:pStyle w:val="BodyText"/>
+      </w:pPr>
+      <w:r>
         <w:t xml:space="preserve">핵심 흐름:</w:t>
       </w:r>
     </w:p>
@@ -572,14 +908,35 @@
         </w:pict>
       </w:r>
     </w:p>
-    <w:bookmarkEnd w:id="10"/>
-    <w:bookmarkStart w:id="11" w:name="지원-직무-매칭"/>
+    <w:bookmarkEnd w:id="11"/>
+    <w:bookmarkStart w:id="12" w:name="지원-직무-매칭"/>
     <w:p>
       <w:pPr>
         <w:pStyle w:val="Heading2"/>
       </w:pPr>
       <w:r>
         <w:t xml:space="preserve">2. 지원 직무 매칭</w:t>
+      </w:r>
+    </w:p>
+    <w:p>
+      <w:pPr>
+        <w:pStyle w:val="FirstParagraph"/>
+      </w:pPr>
+      <w:r>
+        <w:t xml:space="preserve">데이터 엔지니어 지원용 문서이므로, 핵심 강조점은 LLM 자체가 아니라</w:t>
+      </w:r>
+      <w:r>
+        <w:t xml:space="preserve"> </w:t>
+      </w:r>
+      <w:r>
+        <w:rPr>
+          <w:b/>
+          <w:bCs/>
+        </w:rPr>
+        <w:t xml:space="preserve">수집-적재-모델링-품질-서빙으로 이어지는 데이터 제품화 흐름</w:t>
+      </w:r>
+      <w:r>
+        <w:t xml:space="preserve">입니다. Text2SQL은 이 데이터 플랫폼 위에 붙인 소비 인터페이스이자 운영/검증 경계로 설명합니다.</w:t>
       </w:r>
     </w:p>
     <w:tbl>
@@ -696,7 +1053,7 @@
               <w:pStyle w:val="Compact"/>
             </w:pPr>
             <w:r>
-              <w:t xml:space="preserve">dbt tests, expected-SQL eval, negative Text2SQL eval</w:t>
+              <w:t xml:space="preserve">dbt tests, idempotency check, expected-SQL baseline</w:t>
             </w:r>
           </w:p>
         </w:tc>
@@ -790,30 +1147,6 @@
               <w:pStyle w:val="Compact"/>
             </w:pPr>
             <w:r>
-              <w:t xml:space="preserve">ML/feature workflow 이해</w:t>
-            </w:r>
-          </w:p>
-        </w:tc>
-        <w:tc>
-          <w:tcPr/>
-          <w:p>
-            <w:pPr>
-              <w:pStyle w:val="Compact"/>
-            </w:pPr>
-            <w:r>
-              <w:t xml:space="preserve">ROAS feature tables, model comparison, artifact-backed serving</w:t>
-            </w:r>
-          </w:p>
-        </w:tc>
-      </w:tr>
-      <w:tr>
-        <w:tc>
-          <w:tcPr/>
-          <w:p>
-            <w:pPr>
-              <w:pStyle w:val="Compact"/>
-            </w:pPr>
-            <w:r>
               <w:t xml:space="preserve">운영/관측성</w:t>
             </w:r>
           </w:p>
@@ -825,7 +1158,7 @@
               <w:pStyle w:val="Compact"/>
             </w:pPr>
             <w:r>
-              <w:t xml:space="preserve">provider cost, latency, fallback reason, audit JSONL</w:t>
+              <w:t xml:space="preserve">CI, audit JSONL, provider cost/latency/fallback reason</w:t>
             </w:r>
           </w:p>
         </w:tc>
@@ -850,6 +1183,30 @@
             </w:pPr>
             <w:r>
               <w:t xml:space="preserve">MWAA, RDS/Aurora, S3, ECS Fargate, CloudWatch, QuickSight mapping</w:t>
+            </w:r>
+          </w:p>
+        </w:tc>
+      </w:tr>
+      <w:tr>
+        <w:tc>
+          <w:tcPr/>
+          <w:p>
+            <w:pPr>
+              <w:pStyle w:val="Compact"/>
+            </w:pPr>
+            <w:r>
+              <w:t xml:space="preserve">AI/LLM 데이터 인터페이스</w:t>
+            </w:r>
+          </w:p>
+        </w:tc>
+        <w:tc>
+          <w:tcPr/>
+          <w:p>
+            <w:pPr>
+              <w:pStyle w:val="Compact"/>
+            </w:pPr>
+            <w:r>
+              <w:t xml:space="preserve">Text2SQL validator, gateway, 정답형/안전성 질의 평가</w:t>
             </w:r>
           </w:p>
         </w:tc>
@@ -862,111 +1219,14 @@
         </w:pict>
       </w:r>
     </w:p>
-    <w:bookmarkEnd w:id="11"/>
-    <w:bookmarkStart w:id="15" w:name="담당-역할과-문제-정의"/>
+    <w:bookmarkEnd w:id="12"/>
+    <w:bookmarkStart w:id="13" w:name="내가-직접-구현한-범위"/>
     <w:p>
       <w:pPr>
         <w:pStyle w:val="Heading2"/>
       </w:pPr>
       <w:r>
-        <w:t xml:space="preserve">3. 담당 역할과 문제 정의</w:t>
-      </w:r>
-    </w:p>
-    <w:bookmarkStart w:id="12" w:name="문제"/>
-    <w:p>
-      <w:pPr>
-        <w:pStyle w:val="Heading3"/>
-      </w:pPr>
-      <w:r>
-        <w:t xml:space="preserve">문제</w:t>
-      </w:r>
-    </w:p>
-    <w:p>
-      <w:pPr>
-        <w:pStyle w:val="FirstParagraph"/>
-      </w:pPr>
-      <w:r>
-        <w:t xml:space="preserve">인플루언서 광고 성과는 게시물 반응, 캠페인 attribution, 결제 전환, ROAS 지표가 분리되어 있어 “어떤 캠페인이 성과가 좋았는지”를 빠르게 판단하기 어렵다.</w:t>
-      </w:r>
-    </w:p>
-    <w:bookmarkEnd w:id="12"/>
-    <w:bookmarkStart w:id="13" w:name="내가-설계한-해결-방식"/>
-    <w:p>
-      <w:pPr>
-        <w:pStyle w:val="Heading3"/>
-      </w:pPr>
-      <w:r>
-        <w:t xml:space="preserve">내가 설계한 해결 방식</w:t>
-      </w:r>
-    </w:p>
-    <w:p>
-      <w:pPr>
-        <w:pStyle w:val="Compact"/>
-        <w:numPr>
-          <w:ilvl w:val="0"/>
-          <w:numId w:val="1002"/>
-        </w:numPr>
-      </w:pPr>
-      <w:r>
-        <w:t xml:space="preserve">Instagram 수집 데이터를 raw schema에 보존한다.</w:t>
-      </w:r>
-    </w:p>
-    <w:p>
-      <w:pPr>
-        <w:pStyle w:val="Compact"/>
-        <w:numPr>
-          <w:ilvl w:val="0"/>
-          <w:numId w:val="1002"/>
-        </w:numPr>
-      </w:pPr>
-      <w:r>
-        <w:t xml:space="preserve">결제 데이터는 공개 포트폴리오에 실제 데이터를 사용할 수 없으므로 synthetic payment benchmark로 만든다.</w:t>
-      </w:r>
-    </w:p>
-    <w:p>
-      <w:pPr>
-        <w:pStyle w:val="Compact"/>
-        <w:numPr>
-          <w:ilvl w:val="0"/>
-          <w:numId w:val="1002"/>
-        </w:numPr>
-      </w:pPr>
-      <w:r>
-        <w:t xml:space="preserve">dbt로 campaign-grain ROI mart와 feature table을 만든다.</w:t>
-      </w:r>
-    </w:p>
-    <w:p>
-      <w:pPr>
-        <w:pStyle w:val="Compact"/>
-        <w:numPr>
-          <w:ilvl w:val="0"/>
-          <w:numId w:val="1002"/>
-        </w:numPr>
-      </w:pPr>
-      <w:r>
-        <w:t xml:space="preserve">Superset dashboard와 FastAPI endpoint로 소비 경로를 만든다.</w:t>
-      </w:r>
-    </w:p>
-    <w:p>
-      <w:pPr>
-        <w:pStyle w:val="Compact"/>
-        <w:numPr>
-          <w:ilvl w:val="0"/>
-          <w:numId w:val="1002"/>
-        </w:numPr>
-      </w:pPr>
-      <w:r>
-        <w:t xml:space="preserve">Text2SQL API를 붙이되, generated SQL은 validator와 audit boundary를 통과해야만 실행한다.</w:t>
-      </w:r>
-    </w:p>
-    <w:bookmarkEnd w:id="13"/>
-    <w:bookmarkStart w:id="14" w:name="주요-의사결정"/>
-    <w:p>
-      <w:pPr>
-        <w:pStyle w:val="Heading3"/>
-      </w:pPr>
-      <w:r>
-        <w:t xml:space="preserve">주요 의사결정</w:t>
+        <w:t xml:space="preserve">3. 내가 직접 구현한 범위</w:t>
       </w:r>
     </w:p>
     <w:tbl>
@@ -991,125 +1251,190 @@
               <w:pStyle w:val="Compact"/>
             </w:pPr>
             <w:r>
-              <w:t xml:space="preserve">결정</w:t>
-            </w:r>
-          </w:p>
-        </w:tc>
-        <w:tc>
-          <w:tcPr/>
-          <w:p>
-            <w:pPr>
-              <w:pStyle w:val="Compact"/>
-            </w:pPr>
-            <w:r>
-              <w:t xml:space="preserve">이유</w:t>
-            </w:r>
-          </w:p>
-        </w:tc>
-      </w:tr>
-      <w:tr>
-        <w:tc>
-          <w:tcPr/>
-          <w:p>
-            <w:pPr>
-              <w:pStyle w:val="Compact"/>
-            </w:pPr>
-            <w:r>
-              <w:t xml:space="preserve">raw 원본 보존</w:t>
-            </w:r>
-          </w:p>
-        </w:tc>
-        <w:tc>
-          <w:tcPr/>
-          <w:p>
-            <w:pPr>
-              <w:pStyle w:val="Compact"/>
-            </w:pPr>
-            <w:r>
-              <w:t xml:space="preserve">재빌드, 감사, 디버깅이 가능하도록 변환을 staging 이후로 제한</w:t>
-            </w:r>
-          </w:p>
-        </w:tc>
-      </w:tr>
-      <w:tr>
-        <w:tc>
-          <w:tcPr/>
-          <w:p>
-            <w:pPr>
-              <w:pStyle w:val="Compact"/>
-            </w:pPr>
-            <w:r>
-              <w:t xml:space="preserve">layered dbt 모델</w:t>
-            </w:r>
-          </w:p>
-        </w:tc>
-        <w:tc>
-          <w:tcPr/>
-          <w:p>
-            <w:pPr>
-              <w:pStyle w:val="Compact"/>
-            </w:pPr>
-            <w:r>
-              <w:t xml:space="preserve">각 레이어의 책임과 grain을 분리</w:t>
-            </w:r>
-          </w:p>
-        </w:tc>
-      </w:tr>
-      <w:tr>
-        <w:tc>
-          <w:tcPr/>
-          <w:p>
-            <w:pPr>
-              <w:pStyle w:val="Compact"/>
-            </w:pPr>
-            <w:r>
-              <w:t xml:space="preserve">synthetic payment 명시</w:t>
-            </w:r>
-          </w:p>
-        </w:tc>
-        <w:tc>
-          <w:tcPr/>
-          <w:p>
-            <w:pPr>
-              <w:pStyle w:val="Compact"/>
-            </w:pPr>
-            <w:r>
-              <w:t xml:space="preserve">민감한 결제 데이터를 공개 포트폴리오에 쓰지 않기 위함</w:t>
-            </w:r>
-          </w:p>
-        </w:tc>
-      </w:tr>
-      <w:tr>
-        <w:tc>
-          <w:tcPr/>
-          <w:p>
-            <w:pPr>
-              <w:pStyle w:val="Compact"/>
-            </w:pPr>
-            <w:r>
-              <w:t xml:space="preserve">단순 ROAS 모델 우선</w:t>
-            </w:r>
-          </w:p>
-        </w:tc>
-        <w:tc>
-          <w:tcPr/>
-          <w:p>
-            <w:pPr>
-              <w:pStyle w:val="Compact"/>
-            </w:pPr>
-            <w:r>
-              <w:t xml:space="preserve">labeled row가 25개라 복잡한 모델 성능 주장을 피함</w:t>
-            </w:r>
-          </w:p>
-        </w:tc>
-      </w:tr>
-      <w:tr>
-        <w:tc>
-          <w:tcPr/>
-          <w:p>
-            <w:pPr>
-              <w:pStyle w:val="Compact"/>
-            </w:pPr>
+              <w:t xml:space="preserve">범위</w:t>
+            </w:r>
+          </w:p>
+        </w:tc>
+        <w:tc>
+          <w:tcPr/>
+          <w:p>
+            <w:pPr>
+              <w:pStyle w:val="Compact"/>
+            </w:pPr>
+            <w:r>
+              <w:t xml:space="preserve">직접 구현한 내용</w:t>
+            </w:r>
+          </w:p>
+        </w:tc>
+      </w:tr>
+      <w:tr>
+        <w:tc>
+          <w:tcPr/>
+          <w:p>
+            <w:pPr>
+              <w:pStyle w:val="Compact"/>
+            </w:pPr>
+            <w:r>
+              <w:t xml:space="preserve">데이터 수집</w:t>
+            </w:r>
+          </w:p>
+        </w:tc>
+        <w:tc>
+          <w:tcPr/>
+          <w:p>
+            <w:pPr>
+              <w:pStyle w:val="Compact"/>
+            </w:pPr>
+            <w:r>
+              <w:t xml:space="preserve">Apify 기반 Instagram 수집 함수, Airflow smoke/daily/backfill DAG</w:t>
+            </w:r>
+          </w:p>
+        </w:tc>
+      </w:tr>
+      <w:tr>
+        <w:tc>
+          <w:tcPr/>
+          <w:p>
+            <w:pPr>
+              <w:pStyle w:val="Compact"/>
+            </w:pPr>
+            <w:r>
+              <w:t xml:space="preserve">저장/적재</w:t>
+            </w:r>
+          </w:p>
+        </w:tc>
+        <w:tc>
+          <w:tcPr/>
+          <w:p>
+            <w:pPr>
+              <w:pStyle w:val="Compact"/>
+            </w:pPr>
+            <w:r>
+              <w:t xml:space="preserve">PostgreSQL raw schema, source lineage table, upsert/load flow</w:t>
+            </w:r>
+          </w:p>
+        </w:tc>
+      </w:tr>
+      <w:tr>
+        <w:tc>
+          <w:tcPr/>
+          <w:p>
+            <w:pPr>
+              <w:pStyle w:val="Compact"/>
+            </w:pPr>
+            <w:r>
+              <w:t xml:space="preserve">변환/모델링</w:t>
+            </w:r>
+          </w:p>
+        </w:tc>
+        <w:tc>
+          <w:tcPr/>
+          <w:p>
+            <w:pPr>
+              <w:pStyle w:val="Compact"/>
+            </w:pPr>
+            <w:r>
+              <w:t xml:space="preserve">dbt staging, intermediate, marts, features, ai_native 레이어</w:t>
+            </w:r>
+          </w:p>
+        </w:tc>
+      </w:tr>
+      <w:tr>
+        <w:tc>
+          <w:tcPr/>
+          <w:p>
+            <w:pPr>
+              <w:pStyle w:val="Compact"/>
+            </w:pPr>
+            <w:r>
+              <w:t xml:space="preserve">분석/BI</w:t>
+            </w:r>
+          </w:p>
+        </w:tc>
+        <w:tc>
+          <w:tcPr/>
+          <w:p>
+            <w:pPr>
+              <w:pStyle w:val="Compact"/>
+            </w:pPr>
+            <w:r>
+              <w:t xml:space="preserve">Superset dataset, chart, dashboard, export, screenshot evidence</w:t>
+            </w:r>
+          </w:p>
+        </w:tc>
+      </w:tr>
+      <w:tr>
+        <w:tc>
+          <w:tcPr/>
+          <w:p>
+            <w:pPr>
+              <w:pStyle w:val="Compact"/>
+            </w:pPr>
+            <w:r>
+              <w:t xml:space="preserve">ML workflow</w:t>
+            </w:r>
+          </w:p>
+        </w:tc>
+        <w:tc>
+          <w:tcPr/>
+          <w:p>
+            <w:pPr>
+              <w:pStyle w:val="Compact"/>
+            </w:pPr>
+            <w:r>
+              <w:t xml:space="preserve">ROAS feature table, model comparison, model artifact export</w:t>
+            </w:r>
+          </w:p>
+        </w:tc>
+      </w:tr>
+      <w:tr>
+        <w:tc>
+          <w:tcPr/>
+          <w:p>
+            <w:pPr>
+              <w:pStyle w:val="Compact"/>
+            </w:pPr>
+            <w:r>
+              <w:t xml:space="preserve">API serving</w:t>
+            </w:r>
+          </w:p>
+        </w:tc>
+        <w:tc>
+          <w:tcPr/>
+          <w:p>
+            <w:pPr>
+              <w:pStyle w:val="Compact"/>
+            </w:pPr>
+            <w:r>
+              <w:t xml:space="preserve">FastAPI</w:t>
+            </w:r>
+            <w:r>
+              <w:t xml:space="preserve"> </w:t>
+            </w:r>
+            <w:r>
+              <w:rPr>
+                <w:rStyle w:val="VerbatimChar"/>
+              </w:rPr>
+              <w:t xml:space="preserve">/health</w:t>
+            </w:r>
+            <w:r>
+              <w:t xml:space="preserve">,</w:t>
+            </w:r>
+            <w:r>
+              <w:t xml:space="preserve"> </w:t>
+            </w:r>
+            <w:r>
+              <w:rPr>
+                <w:rStyle w:val="VerbatimChar"/>
+              </w:rPr>
+              <w:t xml:space="preserve">/predict/campaign-roas</w:t>
+            </w:r>
+            <w:r>
+              <w:t xml:space="preserve">,</w:t>
+            </w:r>
+            <w:r>
+              <w:t xml:space="preserve"> </w:t>
+            </w:r>
             <w:r>
               <w:rPr>
                 <w:rStyle w:val="VerbatimChar"/>
@@ -1117,7 +1442,7 @@
               <w:t xml:space="preserve">/query</w:t>
             </w:r>
             <w:r>
-              <w:t xml:space="preserve">와</w:t>
+              <w:t xml:space="preserve">,</w:t>
             </w:r>
             <w:r>
               <w:t xml:space="preserve"> </w:t>
@@ -1128,22 +1453,125 @@
               </w:rPr>
               <w:t xml:space="preserve">/query/v2</w:t>
             </w:r>
+          </w:p>
+        </w:tc>
+      </w:tr>
+      <w:tr>
+        <w:tc>
+          <w:tcPr/>
+          <w:p>
+            <w:pPr>
+              <w:pStyle w:val="Compact"/>
+            </w:pPr>
+            <w:r>
+              <w:t xml:space="preserve">Text2SQL safety</w:t>
+            </w:r>
+          </w:p>
+        </w:tc>
+        <w:tc>
+          <w:tcPr/>
+          <w:p>
+            <w:pPr>
+              <w:pStyle w:val="Compact"/>
+            </w:pPr>
+            <w:r>
+              <w:t xml:space="preserve">expected-SQL registry, SQL validator, statement timeout, 안전성 질의 평가, audit log</w:t>
+            </w:r>
+          </w:p>
+        </w:tc>
+      </w:tr>
+      <w:tr>
+        <w:tc>
+          <w:tcPr/>
+          <w:p>
+            <w:pPr>
+              <w:pStyle w:val="Compact"/>
+            </w:pPr>
+            <w:r>
+              <w:t xml:space="preserve">Provider gateway</w:t>
+            </w:r>
+          </w:p>
+        </w:tc>
+        <w:tc>
+          <w:tcPr/>
+          <w:p>
+            <w:pPr>
+              <w:pStyle w:val="Compact"/>
+            </w:pPr>
+            <w:r>
+              <w:t xml:space="preserve">mock/Ollama/OpenAI/Gemini/dual fallback gateway boundary</w:t>
+            </w:r>
+          </w:p>
+        </w:tc>
+      </w:tr>
+      <w:tr>
+        <w:tc>
+          <w:tcPr/>
+          <w:p>
+            <w:pPr>
+              <w:pStyle w:val="Compact"/>
+            </w:pPr>
+            <w:r>
+              <w:t xml:space="preserve">품질/운영</w:t>
+            </w:r>
+          </w:p>
+        </w:tc>
+        <w:tc>
+          <w:tcPr/>
+          <w:p>
+            <w:pPr>
+              <w:pStyle w:val="Compact"/>
+            </w:pPr>
+            <w:r>
+              <w:t xml:space="preserve">GitHub Actions CI,</w:t>
+            </w:r>
             <w:r>
               <w:t xml:space="preserve"> </w:t>
             </w:r>
             <w:r>
-              <w:t xml:space="preserve">분리</w:t>
-            </w:r>
-          </w:p>
-        </w:tc>
-        <w:tc>
-          <w:tcPr/>
-          <w:p>
-            <w:pPr>
-              <w:pStyle w:val="Compact"/>
-            </w:pPr>
-            <w:r>
-              <w:t xml:space="preserve">안정 baseline과 generated-SQL 실험 경로를 분리</w:t>
+              <w:rPr>
+                <w:rStyle w:val="VerbatimChar"/>
+              </w:rPr>
+              <w:t xml:space="preserve">ruff</w:t>
+            </w:r>
+            <w:r>
+              <w:t xml:space="preserve">,</w:t>
+            </w:r>
+            <w:r>
+              <w:t xml:space="preserve"> </w:t>
+            </w:r>
+            <w:r>
+              <w:rPr>
+                <w:rStyle w:val="VerbatimChar"/>
+              </w:rPr>
+              <w:t xml:space="preserve">pytest</w:t>
+            </w:r>
+            <w:r>
+              <w:t xml:space="preserve">, portfolio metric/evidence 문서화</w:t>
+            </w:r>
+          </w:p>
+        </w:tc>
+      </w:tr>
+      <w:tr>
+        <w:tc>
+          <w:tcPr/>
+          <w:p>
+            <w:pPr>
+              <w:pStyle w:val="Compact"/>
+            </w:pPr>
+            <w:r>
+              <w:t xml:space="preserve">제출 자산</w:t>
+            </w:r>
+          </w:p>
+        </w:tc>
+        <w:tc>
+          <w:tcPr/>
+          <w:p>
+            <w:pPr>
+              <w:pStyle w:val="Compact"/>
+            </w:pPr>
+            <w:r>
+              <w:t xml:space="preserve">README, 영문 README, 한국 기업 제출용 문서, DOCX/HTML export, 이력서 bullet, 면접 flashcards</w:t>
             </w:r>
           </w:p>
         </w:tc>
@@ -1156,15 +1584,309 @@
         </w:pict>
       </w:r>
     </w:p>
+    <w:bookmarkEnd w:id="13"/>
+    <w:bookmarkStart w:id="17" w:name="담당-역할과-문제-정의"/>
+    <w:p>
+      <w:pPr>
+        <w:pStyle w:val="Heading2"/>
+      </w:pPr>
+      <w:r>
+        <w:t xml:space="preserve">4. 담당 역할과 문제 정의</w:t>
+      </w:r>
+    </w:p>
+    <w:bookmarkStart w:id="14" w:name="문제"/>
+    <w:p>
+      <w:pPr>
+        <w:pStyle w:val="Heading3"/>
+      </w:pPr>
+      <w:r>
+        <w:t xml:space="preserve">문제</w:t>
+      </w:r>
+    </w:p>
+    <w:p>
+      <w:pPr>
+        <w:pStyle w:val="FirstParagraph"/>
+      </w:pPr>
+      <w:r>
+        <w:t xml:space="preserve">인플루언서 광고 성과는 게시물 반응, 캠페인 attribution, 결제 전환, ROAS 지표가 분리되어 있어 “어떤 캠페인이 성과가 좋았는지”를 빠르게 판단하기 어렵다.</w:t>
+      </w:r>
+    </w:p>
     <w:bookmarkEnd w:id="14"/>
+    <w:bookmarkStart w:id="15" w:name="내가-설계한-해결-방식"/>
+    <w:p>
+      <w:pPr>
+        <w:pStyle w:val="Heading3"/>
+      </w:pPr>
+      <w:r>
+        <w:t xml:space="preserve">내가 설계한 해결 방식</w:t>
+      </w:r>
+    </w:p>
+    <w:p>
+      <w:pPr>
+        <w:pStyle w:val="Compact"/>
+        <w:numPr>
+          <w:ilvl w:val="0"/>
+          <w:numId w:val="1002"/>
+        </w:numPr>
+      </w:pPr>
+      <w:r>
+        <w:t xml:space="preserve">Instagram 수집 데이터를 raw schema에 보존한다.</w:t>
+      </w:r>
+    </w:p>
+    <w:p>
+      <w:pPr>
+        <w:pStyle w:val="Compact"/>
+        <w:numPr>
+          <w:ilvl w:val="0"/>
+          <w:numId w:val="1002"/>
+        </w:numPr>
+      </w:pPr>
+      <w:r>
+        <w:t xml:space="preserve">결제 데이터는 공개 포트폴리오에 실제 데이터를 사용할 수 없으므로 synthetic payment benchmark로 만든다.</w:t>
+      </w:r>
+    </w:p>
+    <w:p>
+      <w:pPr>
+        <w:pStyle w:val="Compact"/>
+        <w:numPr>
+          <w:ilvl w:val="0"/>
+          <w:numId w:val="1002"/>
+        </w:numPr>
+      </w:pPr>
+      <w:r>
+        <w:t xml:space="preserve">dbt로 campaign-grain ROI mart와 feature table을 만든다.</w:t>
+      </w:r>
+    </w:p>
+    <w:p>
+      <w:pPr>
+        <w:pStyle w:val="Compact"/>
+        <w:numPr>
+          <w:ilvl w:val="0"/>
+          <w:numId w:val="1002"/>
+        </w:numPr>
+      </w:pPr>
+      <w:r>
+        <w:t xml:space="preserve">Superset dashboard와 FastAPI endpoint로 소비 경로를 만든다.</w:t>
+      </w:r>
+    </w:p>
+    <w:p>
+      <w:pPr>
+        <w:pStyle w:val="Compact"/>
+        <w:numPr>
+          <w:ilvl w:val="0"/>
+          <w:numId w:val="1002"/>
+        </w:numPr>
+      </w:pPr>
+      <w:r>
+        <w:t xml:space="preserve">데이터 소비 인터페이스로 Text2SQL API를 붙이되, generated SQL은 validator와 audit boundary를 통과해야만 실행한다.</w:t>
+      </w:r>
+    </w:p>
     <w:bookmarkEnd w:id="15"/>
-    <w:bookmarkStart w:id="16" w:name="시스템-아키텍처"/>
+    <w:bookmarkStart w:id="16" w:name="주요-의사결정"/>
+    <w:p>
+      <w:pPr>
+        <w:pStyle w:val="Heading3"/>
+      </w:pPr>
+      <w:r>
+        <w:t xml:space="preserve">주요 의사결정</w:t>
+      </w:r>
+    </w:p>
+    <w:tbl>
+      <w:tblPr>
+        <w:tblStyle w:val="Table"/>
+        <w:tblW w:type="pct" w:w="5000"/>
+        <w:tblLayout w:type="fixed"/>
+        <w:tblLook w:firstRow="1" w:lastRow="0" w:firstColumn="0" w:lastColumn="0" w:noHBand="0" w:noVBand="0" w:val="0020"/>
+      </w:tblPr>
+      <w:tblGrid>
+        <w:gridCol w:w="3960"/>
+        <w:gridCol w:w="3960"/>
+      </w:tblGrid>
+      <w:tr>
+        <w:trPr>
+          <w:tblHeader w:val="on"/>
+        </w:trPr>
+        <w:tc>
+          <w:tcPr/>
+          <w:p>
+            <w:pPr>
+              <w:pStyle w:val="Compact"/>
+            </w:pPr>
+            <w:r>
+              <w:t xml:space="preserve">결정</w:t>
+            </w:r>
+          </w:p>
+        </w:tc>
+        <w:tc>
+          <w:tcPr/>
+          <w:p>
+            <w:pPr>
+              <w:pStyle w:val="Compact"/>
+            </w:pPr>
+            <w:r>
+              <w:t xml:space="preserve">이유</w:t>
+            </w:r>
+          </w:p>
+        </w:tc>
+      </w:tr>
+      <w:tr>
+        <w:tc>
+          <w:tcPr/>
+          <w:p>
+            <w:pPr>
+              <w:pStyle w:val="Compact"/>
+            </w:pPr>
+            <w:r>
+              <w:t xml:space="preserve">raw 원본 보존</w:t>
+            </w:r>
+          </w:p>
+        </w:tc>
+        <w:tc>
+          <w:tcPr/>
+          <w:p>
+            <w:pPr>
+              <w:pStyle w:val="Compact"/>
+            </w:pPr>
+            <w:r>
+              <w:t xml:space="preserve">재빌드, 감사, 디버깅이 가능하도록 변환을 staging 이후로 제한</w:t>
+            </w:r>
+          </w:p>
+        </w:tc>
+      </w:tr>
+      <w:tr>
+        <w:tc>
+          <w:tcPr/>
+          <w:p>
+            <w:pPr>
+              <w:pStyle w:val="Compact"/>
+            </w:pPr>
+            <w:r>
+              <w:t xml:space="preserve">layered dbt 모델</w:t>
+            </w:r>
+          </w:p>
+        </w:tc>
+        <w:tc>
+          <w:tcPr/>
+          <w:p>
+            <w:pPr>
+              <w:pStyle w:val="Compact"/>
+            </w:pPr>
+            <w:r>
+              <w:t xml:space="preserve">각 레이어의 책임과 grain을 분리</w:t>
+            </w:r>
+          </w:p>
+        </w:tc>
+      </w:tr>
+      <w:tr>
+        <w:tc>
+          <w:tcPr/>
+          <w:p>
+            <w:pPr>
+              <w:pStyle w:val="Compact"/>
+            </w:pPr>
+            <w:r>
+              <w:t xml:space="preserve">synthetic payment 명시</w:t>
+            </w:r>
+          </w:p>
+        </w:tc>
+        <w:tc>
+          <w:tcPr/>
+          <w:p>
+            <w:pPr>
+              <w:pStyle w:val="Compact"/>
+            </w:pPr>
+            <w:r>
+              <w:t xml:space="preserve">민감한 결제 데이터를 공개 포트폴리오에 쓰지 않기 위함</w:t>
+            </w:r>
+          </w:p>
+        </w:tc>
+      </w:tr>
+      <w:tr>
+        <w:tc>
+          <w:tcPr/>
+          <w:p>
+            <w:pPr>
+              <w:pStyle w:val="Compact"/>
+            </w:pPr>
+            <w:r>
+              <w:t xml:space="preserve">단순 ROAS 모델 우선</w:t>
+            </w:r>
+          </w:p>
+        </w:tc>
+        <w:tc>
+          <w:tcPr/>
+          <w:p>
+            <w:pPr>
+              <w:pStyle w:val="Compact"/>
+            </w:pPr>
+            <w:r>
+              <w:t xml:space="preserve">labeled row가 25개라 복잡한 모델 성능 주장을 피함</w:t>
+            </w:r>
+          </w:p>
+        </w:tc>
+      </w:tr>
+      <w:tr>
+        <w:tc>
+          <w:tcPr/>
+          <w:p>
+            <w:pPr>
+              <w:pStyle w:val="Compact"/>
+            </w:pPr>
+            <w:r>
+              <w:rPr>
+                <w:rStyle w:val="VerbatimChar"/>
+              </w:rPr>
+              <w:t xml:space="preserve">/query</w:t>
+            </w:r>
+            <w:r>
+              <w:t xml:space="preserve">와</w:t>
+            </w:r>
+            <w:r>
+              <w:t xml:space="preserve"> </w:t>
+            </w:r>
+            <w:r>
+              <w:rPr>
+                <w:rStyle w:val="VerbatimChar"/>
+              </w:rPr>
+              <w:t xml:space="preserve">/query/v2</w:t>
+            </w:r>
+            <w:r>
+              <w:t xml:space="preserve"> </w:t>
+            </w:r>
+            <w:r>
+              <w:t xml:space="preserve">분리</w:t>
+            </w:r>
+          </w:p>
+        </w:tc>
+        <w:tc>
+          <w:tcPr/>
+          <w:p>
+            <w:pPr>
+              <w:pStyle w:val="Compact"/>
+            </w:pPr>
+            <w:r>
+              <w:t xml:space="preserve">안정 baseline과 generated-SQL 실험 경로를 분리</w:t>
+            </w:r>
+          </w:p>
+        </w:tc>
+      </w:tr>
+    </w:tbl>
+    <w:p>
+      <w:r>
+        <w:pict>
+          <v:rect style="width:0;height:1.5pt" o:hralign="center" o:hrstd="t" o:hr="t"/>
+        </w:pict>
+      </w:r>
+    </w:p>
+    <w:bookmarkEnd w:id="16"/>
+    <w:bookmarkEnd w:id="17"/>
+    <w:bookmarkStart w:id="18" w:name="시스템-아키텍처"/>
     <w:p>
       <w:pPr>
         <w:pStyle w:val="Heading2"/>
       </w:pPr>
       <w:r>
-        <w:t xml:space="preserve">4. 시스템 아키텍처</w:t>
+        <w:t xml:space="preserve">5. 시스템 아키텍처</w:t>
       </w:r>
     </w:p>
     <w:p>
@@ -1355,17 +2077,17 @@
         </w:pict>
       </w:r>
     </w:p>
-    <w:bookmarkEnd w:id="16"/>
-    <w:bookmarkStart w:id="19" w:name="데이터-모델링"/>
+    <w:bookmarkEnd w:id="18"/>
+    <w:bookmarkStart w:id="21" w:name="데이터-모델링"/>
     <w:p>
       <w:pPr>
         <w:pStyle w:val="Heading2"/>
       </w:pPr>
       <w:r>
-        <w:t xml:space="preserve">5. 데이터 모델링</w:t>
-      </w:r>
-    </w:p>
-    <w:bookmarkStart w:id="17" w:name="dbt-레이어"/>
+        <w:t xml:space="preserve">6. 데이터 모델링</w:t>
+      </w:r>
+    </w:p>
+    <w:bookmarkStart w:id="19" w:name="dbt-레이어"/>
     <w:p>
       <w:pPr>
         <w:pStyle w:val="Heading3"/>
@@ -1701,8 +2423,8 @@
         </w:tc>
       </w:tr>
     </w:tbl>
-    <w:bookmarkEnd w:id="17"/>
-    <w:bookmarkStart w:id="18" w:name="핵심-grain"/>
+    <w:bookmarkEnd w:id="19"/>
+    <w:bookmarkStart w:id="20" w:name="핵심-grain"/>
     <w:p>
       <w:pPr>
         <w:pStyle w:val="Heading3"/>
@@ -1838,15 +2560,839 @@
         </w:pict>
       </w:r>
     </w:p>
-    <w:bookmarkEnd w:id="18"/>
-    <w:bookmarkEnd w:id="19"/>
-    <w:bookmarkStart w:id="20" w:name="파이프라인과-품질-관리"/>
+    <w:bookmarkEnd w:id="20"/>
+    <w:bookmarkEnd w:id="21"/>
+    <w:bookmarkStart w:id="22" w:name="파이프라인과-품질-관리"/>
     <w:p>
       <w:pPr>
         <w:pStyle w:val="Heading2"/>
       </w:pPr>
       <w:r>
-        <w:t xml:space="preserve">6. 파이프라인과 품질 관리</w:t>
+        <w:t xml:space="preserve">7. 파이프라인과 품질 관리</w:t>
+      </w:r>
+    </w:p>
+    <w:tbl>
+      <w:tblPr>
+        <w:tblStyle w:val="Table"/>
+        <w:tblW w:type="auto" w:w="0"/>
+        <w:tblLook w:firstRow="1" w:lastRow="0" w:firstColumn="0" w:lastColumn="0" w:noHBand="0" w:noVBand="0" w:val="0020"/>
+      </w:tblPr>
+      <w:tblGrid>
+        <w:gridCol w:w="3960"/>
+        <w:gridCol w:w="3960"/>
+      </w:tblGrid>
+      <w:tr>
+        <w:trPr>
+          <w:tblHeader w:val="on"/>
+        </w:trPr>
+        <w:tc>
+          <w:tcPr/>
+          <w:p>
+            <w:pPr>
+              <w:pStyle w:val="Compact"/>
+            </w:pPr>
+            <w:r>
+              <w:t xml:space="preserve">항목</w:t>
+            </w:r>
+          </w:p>
+        </w:tc>
+        <w:tc>
+          <w:tcPr/>
+          <w:p>
+            <w:pPr>
+              <w:pStyle w:val="Compact"/>
+            </w:pPr>
+            <w:r>
+              <w:t xml:space="preserve">구현</w:t>
+            </w:r>
+          </w:p>
+        </w:tc>
+      </w:tr>
+      <w:tr>
+        <w:tc>
+          <w:tcPr/>
+          <w:p>
+            <w:pPr>
+              <w:pStyle w:val="Compact"/>
+            </w:pPr>
+            <w:r>
+              <w:t xml:space="preserve">수집</w:t>
+            </w:r>
+          </w:p>
+        </w:tc>
+        <w:tc>
+          <w:tcPr/>
+          <w:p>
+            <w:pPr>
+              <w:pStyle w:val="Compact"/>
+            </w:pPr>
+            <w:r>
+              <w:t xml:space="preserve">Apify collector + Airflow DAG</w:t>
+            </w:r>
+          </w:p>
+        </w:tc>
+      </w:tr>
+      <w:tr>
+        <w:tc>
+          <w:tcPr/>
+          <w:p>
+            <w:pPr>
+              <w:pStyle w:val="Compact"/>
+            </w:pPr>
+            <w:r>
+              <w:t xml:space="preserve">적재</w:t>
+            </w:r>
+          </w:p>
+        </w:tc>
+        <w:tc>
+          <w:tcPr/>
+          <w:p>
+            <w:pPr>
+              <w:pStyle w:val="Compact"/>
+            </w:pPr>
+            <w:r>
+              <w:t xml:space="preserve">Postgres raw schema upsert/load</w:t>
+            </w:r>
+          </w:p>
+        </w:tc>
+      </w:tr>
+      <w:tr>
+        <w:tc>
+          <w:tcPr/>
+          <w:p>
+            <w:pPr>
+              <w:pStyle w:val="Compact"/>
+            </w:pPr>
+            <w:r>
+              <w:t xml:space="preserve">백필</w:t>
+            </w:r>
+          </w:p>
+        </w:tc>
+        <w:tc>
+          <w:tcPr/>
+          <w:p>
+            <w:pPr>
+              <w:pStyle w:val="Compact"/>
+            </w:pPr>
+            <w:r>
+              <w:t xml:space="preserve">Airflow backfill DAG and idempotency check</w:t>
+            </w:r>
+          </w:p>
+        </w:tc>
+      </w:tr>
+      <w:tr>
+        <w:tc>
+          <w:tcPr/>
+          <w:p>
+            <w:pPr>
+              <w:pStyle w:val="Compact"/>
+            </w:pPr>
+            <w:r>
+              <w:t xml:space="preserve">변환</w:t>
+            </w:r>
+          </w:p>
+        </w:tc>
+        <w:tc>
+          <w:tcPr/>
+          <w:p>
+            <w:pPr>
+              <w:pStyle w:val="Compact"/>
+            </w:pPr>
+            <w:r>
+              <w:t xml:space="preserve">dbt run/test</w:t>
+            </w:r>
+          </w:p>
+        </w:tc>
+      </w:tr>
+      <w:tr>
+        <w:tc>
+          <w:tcPr/>
+          <w:p>
+            <w:pPr>
+              <w:pStyle w:val="Compact"/>
+            </w:pPr>
+            <w:r>
+              <w:t xml:space="preserve">스코어링</w:t>
+            </w:r>
+          </w:p>
+        </w:tc>
+        <w:tc>
+          <w:tcPr/>
+          <w:p>
+            <w:pPr>
+              <w:pStyle w:val="Compact"/>
+            </w:pPr>
+            <w:r>
+              <w:t xml:space="preserve">daily ROAS prediction DAG</w:t>
+            </w:r>
+          </w:p>
+        </w:tc>
+      </w:tr>
+      <w:tr>
+        <w:tc>
+          <w:tcPr/>
+          <w:p>
+            <w:pPr>
+              <w:pStyle w:val="Compact"/>
+            </w:pPr>
+            <w:r>
+              <w:t xml:space="preserve">API 테스트</w:t>
+            </w:r>
+          </w:p>
+        </w:tc>
+        <w:tc>
+          <w:tcPr/>
+          <w:p>
+            <w:pPr>
+              <w:pStyle w:val="Compact"/>
+            </w:pPr>
+            <w:r>
+              <w:t xml:space="preserve">FastAPI unit tests</w:t>
+            </w:r>
+          </w:p>
+        </w:tc>
+      </w:tr>
+      <w:tr>
+        <w:tc>
+          <w:tcPr/>
+          <w:p>
+            <w:pPr>
+              <w:pStyle w:val="Compact"/>
+            </w:pPr>
+            <w:r>
+              <w:t xml:space="preserve">Text2SQL 평가</w:t>
+            </w:r>
+          </w:p>
+        </w:tc>
+        <w:tc>
+          <w:tcPr/>
+          <w:p>
+            <w:pPr>
+              <w:pStyle w:val="Compact"/>
+            </w:pPr>
+            <w:r>
+              <w:t xml:space="preserve">정답형 질의 set + 안전성 질의 set</w:t>
+            </w:r>
+          </w:p>
+        </w:tc>
+      </w:tr>
+      <w:tr>
+        <w:tc>
+          <w:tcPr/>
+          <w:p>
+            <w:pPr>
+              <w:pStyle w:val="Compact"/>
+            </w:pPr>
+            <w:r>
+              <w:t xml:space="preserve">CI</w:t>
+            </w:r>
+          </w:p>
+        </w:tc>
+        <w:tc>
+          <w:tcPr/>
+          <w:p>
+            <w:pPr>
+              <w:pStyle w:val="Compact"/>
+            </w:pPr>
+            <w:r>
+              <w:t xml:space="preserve">GitHub Actions</w:t>
+            </w:r>
+            <w:r>
+              <w:t xml:space="preserve"> </w:t>
+            </w:r>
+            <w:r>
+              <w:rPr>
+                <w:rStyle w:val="VerbatimChar"/>
+              </w:rPr>
+              <w:t xml:space="preserve">ruff</w:t>
+            </w:r>
+            <w:r>
+              <w:t xml:space="preserve"> </w:t>
+            </w:r>
+            <w:r>
+              <w:t xml:space="preserve">+</w:t>
+            </w:r>
+            <w:r>
+              <w:t xml:space="preserve"> </w:t>
+            </w:r>
+            <w:r>
+              <w:rPr>
+                <w:rStyle w:val="VerbatimChar"/>
+              </w:rPr>
+              <w:t xml:space="preserve">pytest</w:t>
+            </w:r>
+          </w:p>
+        </w:tc>
+      </w:tr>
+    </w:tbl>
+    <w:p>
+      <w:pPr>
+        <w:pStyle w:val="BodyText"/>
+      </w:pPr>
+      <w:r>
+        <w:t xml:space="preserve">최신 문서화된 품질 게이트:</w:t>
+      </w:r>
+    </w:p>
+    <w:p>
+      <w:pPr>
+        <w:pStyle w:val="Compact"/>
+        <w:numPr>
+          <w:ilvl w:val="0"/>
+          <w:numId w:val="1004"/>
+        </w:numPr>
+      </w:pPr>
+      <w:r>
+        <w:rPr>
+          <w:rStyle w:val="VerbatimChar"/>
+        </w:rPr>
+        <w:t xml:space="preserve">ruff</w:t>
+      </w:r>
+      <w:r>
+        <w:t xml:space="preserve"> </w:t>
+      </w:r>
+      <w:r>
+        <w:t xml:space="preserve">pass</w:t>
+      </w:r>
+    </w:p>
+    <w:p>
+      <w:pPr>
+        <w:pStyle w:val="Compact"/>
+        <w:numPr>
+          <w:ilvl w:val="0"/>
+          <w:numId w:val="1004"/>
+        </w:numPr>
+      </w:pPr>
+      <w:r>
+        <w:rPr>
+          <w:rStyle w:val="VerbatimChar"/>
+        </w:rPr>
+        <w:t xml:space="preserve">pytest 82 passed</w:t>
+      </w:r>
+    </w:p>
+    <w:p>
+      <w:pPr>
+        <w:pStyle w:val="Compact"/>
+        <w:numPr>
+          <w:ilvl w:val="0"/>
+          <w:numId w:val="1004"/>
+        </w:numPr>
+      </w:pPr>
+      <w:r>
+        <w:rPr>
+          <w:rStyle w:val="VerbatimChar"/>
+        </w:rPr>
+        <w:t xml:space="preserve">git diff --check</w:t>
+      </w:r>
+      <w:r>
+        <w:t xml:space="preserve"> </w:t>
+      </w:r>
+      <w:r>
+        <w:t xml:space="preserve">pass</w:t>
+      </w:r>
+    </w:p>
+    <w:p>
+      <w:r>
+        <w:pict>
+          <v:rect style="width:0;height:1.5pt" o:hralign="center" o:hrstd="t" o:hr="t"/>
+        </w:pict>
+      </w:r>
+    </w:p>
+    <w:bookmarkEnd w:id="22"/>
+    <w:bookmarkStart w:id="24" w:name="주요-성과-지표"/>
+    <w:p>
+      <w:pPr>
+        <w:pStyle w:val="Heading2"/>
+      </w:pPr>
+      <w:r>
+        <w:t xml:space="preserve">8. 주요 성과 지표</w:t>
+      </w:r>
+    </w:p>
+    <w:tbl>
+      <w:tblPr>
+        <w:tblStyle w:val="Table"/>
+        <w:tblW w:type="pct" w:w="5000"/>
+        <w:tblLayout w:type="fixed"/>
+        <w:tblLook w:firstRow="1" w:lastRow="0" w:firstColumn="0" w:lastColumn="0" w:noHBand="0" w:noVBand="0" w:val="0020"/>
+      </w:tblPr>
+      <w:tblGrid>
+        <w:gridCol w:w="3394"/>
+        <w:gridCol w:w="4525"/>
+      </w:tblGrid>
+      <w:tr>
+        <w:trPr>
+          <w:tblHeader w:val="on"/>
+        </w:trPr>
+        <w:tc>
+          <w:tcPr/>
+          <w:p>
+            <w:pPr>
+              <w:pStyle w:val="Compact"/>
+            </w:pPr>
+            <w:r>
+              <w:t xml:space="preserve">영역</w:t>
+            </w:r>
+          </w:p>
+        </w:tc>
+        <w:tc>
+          <w:tcPr/>
+          <w:p>
+            <w:pPr>
+              <w:pStyle w:val="Compact"/>
+              <w:jc w:val="right"/>
+            </w:pPr>
+            <w:r>
+              <w:t xml:space="preserve">결과</w:t>
+            </w:r>
+          </w:p>
+        </w:tc>
+      </w:tr>
+      <w:tr>
+        <w:tc>
+          <w:tcPr/>
+          <w:p>
+            <w:pPr>
+              <w:pStyle w:val="Compact"/>
+            </w:pPr>
+            <w:r>
+              <w:t xml:space="preserve">Phase 2B daily adaptive run</w:t>
+            </w:r>
+          </w:p>
+        </w:tc>
+        <w:tc>
+          <w:tcPr/>
+          <w:p>
+            <w:pPr>
+              <w:pStyle w:val="Compact"/>
+              <w:jc w:val="right"/>
+            </w:pPr>
+            <w:r>
+              <w:rPr>
+                <w:rStyle w:val="VerbatimChar"/>
+              </w:rPr>
+              <w:t xml:space="preserve">1,725</w:t>
+            </w:r>
+            <w:r>
+              <w:t xml:space="preserve">건 수집,</w:t>
+            </w:r>
+            <w:r>
+              <w:t xml:space="preserve"> </w:t>
+            </w:r>
+            <w:r>
+              <w:rPr>
+                <w:rStyle w:val="VerbatimChar"/>
+              </w:rPr>
+              <w:t xml:space="preserve">1,410</w:t>
+            </w:r>
+            <w:r>
+              <w:t xml:space="preserve">건 신규 적재</w:t>
+            </w:r>
+          </w:p>
+        </w:tc>
+      </w:tr>
+      <w:tr>
+        <w:tc>
+          <w:tcPr/>
+          <w:p>
+            <w:pPr>
+              <w:pStyle w:val="Compact"/>
+            </w:pPr>
+            <w:r>
+              <w:t xml:space="preserve">Synthetic payment benchmark</w:t>
+            </w:r>
+          </w:p>
+        </w:tc>
+        <w:tc>
+          <w:tcPr/>
+          <w:p>
+            <w:pPr>
+              <w:pStyle w:val="Compact"/>
+              <w:jc w:val="right"/>
+            </w:pPr>
+            <w:r>
+              <w:rPr>
+                <w:rStyle w:val="VerbatimChar"/>
+              </w:rPr>
+              <w:t xml:space="preserve">498</w:t>
+            </w:r>
+            <w:r>
+              <w:t xml:space="preserve"> </w:t>
+            </w:r>
+            <w:r>
+              <w:t xml:space="preserve">payment events</w:t>
+            </w:r>
+          </w:p>
+        </w:tc>
+      </w:tr>
+      <w:tr>
+        <w:tc>
+          <w:tcPr/>
+          <w:p>
+            <w:pPr>
+              <w:pStyle w:val="Compact"/>
+            </w:pPr>
+            <w:r>
+              <w:t xml:space="preserve">Synthetic net payment</w:t>
+            </w:r>
+          </w:p>
+        </w:tc>
+        <w:tc>
+          <w:tcPr/>
+          <w:p>
+            <w:pPr>
+              <w:pStyle w:val="Compact"/>
+              <w:jc w:val="right"/>
+            </w:pPr>
+            <w:r>
+              <w:t xml:space="preserve">KRW</w:t>
+            </w:r>
+            <w:r>
+              <w:t xml:space="preserve"> </w:t>
+            </w:r>
+            <w:r>
+              <w:rPr>
+                <w:rStyle w:val="VerbatimChar"/>
+              </w:rPr>
+              <w:t xml:space="preserve">6,329,923.59</w:t>
+            </w:r>
+          </w:p>
+        </w:tc>
+      </w:tr>
+      <w:tr>
+        <w:tc>
+          <w:tcPr/>
+          <w:p>
+            <w:pPr>
+              <w:pStyle w:val="Compact"/>
+            </w:pPr>
+            <w:r>
+              <w:t xml:space="preserve">Campaign ROI mart</w:t>
+            </w:r>
+          </w:p>
+        </w:tc>
+        <w:tc>
+          <w:tcPr/>
+          <w:p>
+            <w:pPr>
+              <w:pStyle w:val="Compact"/>
+              <w:jc w:val="right"/>
+            </w:pPr>
+            <w:r>
+              <w:rPr>
+                <w:rStyle w:val="VerbatimChar"/>
+              </w:rPr>
+              <w:t xml:space="preserve">30</w:t>
+            </w:r>
+            <w:r>
+              <w:t xml:space="preserve"> </w:t>
+            </w:r>
+            <w:r>
+              <w:t xml:space="preserve">campaign rows, max ROAS</w:t>
+            </w:r>
+            <w:r>
+              <w:t xml:space="preserve"> </w:t>
+            </w:r>
+            <w:r>
+              <w:rPr>
+                <w:rStyle w:val="VerbatimChar"/>
+              </w:rPr>
+              <w:t xml:space="preserve">0.5969</w:t>
+            </w:r>
+          </w:p>
+        </w:tc>
+      </w:tr>
+      <w:tr>
+        <w:tc>
+          <w:tcPr/>
+          <w:p>
+            <w:pPr>
+              <w:pStyle w:val="Compact"/>
+            </w:pPr>
+            <w:r>
+              <w:t xml:space="preserve">Prediction monitor</w:t>
+            </w:r>
+          </w:p>
+        </w:tc>
+        <w:tc>
+          <w:tcPr/>
+          <w:p>
+            <w:pPr>
+              <w:pStyle w:val="Compact"/>
+              <w:jc w:val="right"/>
+            </w:pPr>
+            <w:r>
+              <w:rPr>
+                <w:rStyle w:val="VerbatimChar"/>
+              </w:rPr>
+              <w:t xml:space="preserve">25</w:t>
+            </w:r>
+            <w:r>
+              <w:t xml:space="preserve"> </w:t>
+            </w:r>
+            <w:r>
+              <w:t xml:space="preserve">rows, MAE</w:t>
+            </w:r>
+            <w:r>
+              <w:t xml:space="preserve"> </w:t>
+            </w:r>
+            <w:r>
+              <w:rPr>
+                <w:rStyle w:val="VerbatimChar"/>
+              </w:rPr>
+              <w:t xml:space="preserve">0.0799</w:t>
+            </w:r>
+            <w:r>
+              <w:t xml:space="preserve">, bias</w:t>
+            </w:r>
+            <w:r>
+              <w:t xml:space="preserve"> </w:t>
+            </w:r>
+            <w:r>
+              <w:rPr>
+                <w:rStyle w:val="VerbatimChar"/>
+              </w:rPr>
+              <w:t xml:space="preserve">0.0000</w:t>
+            </w:r>
+          </w:p>
+        </w:tc>
+      </w:tr>
+      <w:tr>
+        <w:tc>
+          <w:tcPr/>
+          <w:p>
+            <w:pPr>
+              <w:pStyle w:val="Compact"/>
+            </w:pPr>
+            <w:r>
+              <w:t xml:space="preserve">ROAS model comparison</w:t>
+            </w:r>
+          </w:p>
+        </w:tc>
+        <w:tc>
+          <w:tcPr/>
+          <w:p>
+            <w:pPr>
+              <w:pStyle w:val="Compact"/>
+              <w:jc w:val="right"/>
+            </w:pPr>
+            <w:r>
+              <w:t xml:space="preserve">baseline MAE</w:t>
+            </w:r>
+            <w:r>
+              <w:t xml:space="preserve"> </w:t>
+            </w:r>
+            <w:r>
+              <w:rPr>
+                <w:rStyle w:val="VerbatimChar"/>
+              </w:rPr>
+              <w:t xml:space="preserve">0.0892</w:t>
+            </w:r>
+            <w:r>
+              <w:t xml:space="preserve"> </w:t>
+            </w:r>
+            <w:r>
+              <w:t xml:space="preserve">-&gt; linear model MAE</w:t>
+            </w:r>
+            <w:r>
+              <w:t xml:space="preserve"> </w:t>
+            </w:r>
+            <w:r>
+              <w:rPr>
+                <w:rStyle w:val="VerbatimChar"/>
+              </w:rPr>
+              <w:t xml:space="preserve">0.0474</w:t>
+            </w:r>
+          </w:p>
+        </w:tc>
+      </w:tr>
+      <w:tr>
+        <w:tc>
+          <w:tcPr/>
+          <w:p>
+            <w:pPr>
+              <w:pStyle w:val="Compact"/>
+            </w:pPr>
+            <w:r>
+              <w:t xml:space="preserve">deterministic Text2SQL baseline</w:t>
+            </w:r>
+          </w:p>
+        </w:tc>
+        <w:tc>
+          <w:tcPr/>
+          <w:p>
+            <w:pPr>
+              <w:pStyle w:val="Compact"/>
+              <w:jc w:val="right"/>
+            </w:pPr>
+            <w:r>
+              <w:t xml:space="preserve">expected-SQL registry</w:t>
+            </w:r>
+            <w:r>
+              <w:t xml:space="preserve"> </w:t>
+            </w:r>
+            <w:r>
+              <w:rPr>
+                <w:rStyle w:val="VerbatimChar"/>
+              </w:rPr>
+              <w:t xml:space="preserve">24/24 PASS</w:t>
+            </w:r>
+          </w:p>
+        </w:tc>
+      </w:tr>
+      <w:tr>
+        <w:tc>
+          <w:tcPr/>
+          <w:p>
+            <w:pPr>
+              <w:pStyle w:val="Compact"/>
+            </w:pPr>
+            <w:r>
+              <w:t xml:space="preserve">OpenAI Text2SQL eval</w:t>
+            </w:r>
+          </w:p>
+        </w:tc>
+        <w:tc>
+          <w:tcPr/>
+          <w:p>
+            <w:pPr>
+              <w:pStyle w:val="Compact"/>
+              <w:jc w:val="right"/>
+            </w:pPr>
+            <w:r>
+              <w:t xml:space="preserve">정답형</w:t>
+            </w:r>
+            <w:r>
+              <w:t xml:space="preserve"> </w:t>
+            </w:r>
+            <w:r>
+              <w:rPr>
+                <w:rStyle w:val="VerbatimChar"/>
+              </w:rPr>
+              <w:t xml:space="preserve">24/24</w:t>
+            </w:r>
+            <w:r>
+              <w:t xml:space="preserve">, 안전성</w:t>
+            </w:r>
+            <w:r>
+              <w:t xml:space="preserve"> </w:t>
+            </w:r>
+            <w:r>
+              <w:rPr>
+                <w:rStyle w:val="VerbatimChar"/>
+              </w:rPr>
+              <w:t xml:space="preserve">14/14</w:t>
+            </w:r>
+          </w:p>
+        </w:tc>
+      </w:tr>
+      <w:tr>
+        <w:tc>
+          <w:tcPr/>
+          <w:p>
+            <w:pPr>
+              <w:pStyle w:val="Compact"/>
+            </w:pPr>
+            <w:r>
+              <w:t xml:space="preserve">Gemini Text2SQL eval</w:t>
+            </w:r>
+          </w:p>
+        </w:tc>
+        <w:tc>
+          <w:tcPr/>
+          <w:p>
+            <w:pPr>
+              <w:pStyle w:val="Compact"/>
+              <w:jc w:val="right"/>
+            </w:pPr>
+            <w:r>
+              <w:t xml:space="preserve">정답형</w:t>
+            </w:r>
+            <w:r>
+              <w:t xml:space="preserve"> </w:t>
+            </w:r>
+            <w:r>
+              <w:rPr>
+                <w:rStyle w:val="VerbatimChar"/>
+              </w:rPr>
+              <w:t xml:space="preserve">24/24</w:t>
+            </w:r>
+            <w:r>
+              <w:t xml:space="preserve">, 안전성</w:t>
+            </w:r>
+            <w:r>
+              <w:t xml:space="preserve"> </w:t>
+            </w:r>
+            <w:r>
+              <w:rPr>
+                <w:rStyle w:val="VerbatimChar"/>
+              </w:rPr>
+              <w:t xml:space="preserve">12/14</w:t>
+            </w:r>
+          </w:p>
+        </w:tc>
+      </w:tr>
+      <w:tr>
+        <w:tc>
+          <w:tcPr/>
+          <w:p>
+            <w:pPr>
+              <w:pStyle w:val="Compact"/>
+            </w:pPr>
+            <w:r>
+              <w:t xml:space="preserve">Provider cost comparison</w:t>
+            </w:r>
+          </w:p>
+        </w:tc>
+        <w:tc>
+          <w:tcPr/>
+          <w:p>
+            <w:pPr>
+              <w:pStyle w:val="Compact"/>
+              <w:jc w:val="right"/>
+            </w:pPr>
+            <w:r>
+              <w:t xml:space="preserve">Gemini</w:t>
+            </w:r>
+            <w:r>
+              <w:t xml:space="preserve"> </w:t>
+            </w:r>
+            <w:r>
+              <w:rPr>
+                <w:rStyle w:val="VerbatimChar"/>
+              </w:rPr>
+              <w:t xml:space="preserve">$0.064098</w:t>
+            </w:r>
+            <w:r>
+              <w:t xml:space="preserve"> </w:t>
+            </w:r>
+            <w:r>
+              <w:t xml:space="preserve">vs OpenAI</w:t>
+            </w:r>
+            <w:r>
+              <w:t xml:space="preserve"> </w:t>
+            </w:r>
+            <w:r>
+              <w:rPr>
+                <w:rStyle w:val="VerbatimChar"/>
+              </w:rPr>
+              <w:t xml:space="preserve">$0.103027</w:t>
+            </w:r>
+            <w:r>
+              <w:t xml:space="preserve"> </w:t>
+            </w:r>
+            <w:r>
+              <w:t xml:space="preserve">over 38 cases</w:t>
+            </w:r>
+          </w:p>
+        </w:tc>
+      </w:tr>
+    </w:tbl>
+    <w:bookmarkStart w:id="23" w:name="채용자-관점의-해석"/>
+    <w:p>
+      <w:pPr>
+        <w:pStyle w:val="Heading3"/>
+      </w:pPr>
+      <w:r>
+        <w:t xml:space="preserve">채용자 관점의 해석</w:t>
       </w:r>
     </w:p>
     <w:tbl>
@@ -1871,210 +3417,37 @@
               <w:pStyle w:val="Compact"/>
             </w:pPr>
             <w:r>
-              <w:t xml:space="preserve">항목</w:t>
-            </w:r>
-          </w:p>
-        </w:tc>
-        <w:tc>
-          <w:tcPr/>
-          <w:p>
-            <w:pPr>
-              <w:pStyle w:val="Compact"/>
-            </w:pPr>
-            <w:r>
-              <w:t xml:space="preserve">구현</w:t>
-            </w:r>
-          </w:p>
-        </w:tc>
-      </w:tr>
-      <w:tr>
-        <w:tc>
-          <w:tcPr/>
-          <w:p>
-            <w:pPr>
-              <w:pStyle w:val="Compact"/>
-            </w:pPr>
-            <w:r>
-              <w:t xml:space="preserve">수집</w:t>
-            </w:r>
-          </w:p>
-        </w:tc>
-        <w:tc>
-          <w:tcPr/>
-          <w:p>
-            <w:pPr>
-              <w:pStyle w:val="Compact"/>
-            </w:pPr>
-            <w:r>
-              <w:t xml:space="preserve">Apify collector + Airflow DAG</w:t>
-            </w:r>
-          </w:p>
-        </w:tc>
-      </w:tr>
-      <w:tr>
-        <w:tc>
-          <w:tcPr/>
-          <w:p>
-            <w:pPr>
-              <w:pStyle w:val="Compact"/>
-            </w:pPr>
-            <w:r>
-              <w:t xml:space="preserve">적재</w:t>
-            </w:r>
-          </w:p>
-        </w:tc>
-        <w:tc>
-          <w:tcPr/>
-          <w:p>
-            <w:pPr>
-              <w:pStyle w:val="Compact"/>
-            </w:pPr>
-            <w:r>
-              <w:t xml:space="preserve">Postgres raw schema upsert/load</w:t>
-            </w:r>
-          </w:p>
-        </w:tc>
-      </w:tr>
-      <w:tr>
-        <w:tc>
-          <w:tcPr/>
-          <w:p>
-            <w:pPr>
-              <w:pStyle w:val="Compact"/>
-            </w:pPr>
-            <w:r>
-              <w:t xml:space="preserve">백필</w:t>
-            </w:r>
-          </w:p>
-        </w:tc>
-        <w:tc>
-          <w:tcPr/>
-          <w:p>
-            <w:pPr>
-              <w:pStyle w:val="Compact"/>
-            </w:pPr>
-            <w:r>
-              <w:t xml:space="preserve">Airflow backfill DAG and idempotency check</w:t>
-            </w:r>
-          </w:p>
-        </w:tc>
-      </w:tr>
-      <w:tr>
-        <w:tc>
-          <w:tcPr/>
-          <w:p>
-            <w:pPr>
-              <w:pStyle w:val="Compact"/>
-            </w:pPr>
-            <w:r>
-              <w:t xml:space="preserve">변환</w:t>
-            </w:r>
-          </w:p>
-        </w:tc>
-        <w:tc>
-          <w:tcPr/>
-          <w:p>
-            <w:pPr>
-              <w:pStyle w:val="Compact"/>
-            </w:pPr>
-            <w:r>
-              <w:t xml:space="preserve">dbt run/test</w:t>
-            </w:r>
-          </w:p>
-        </w:tc>
-      </w:tr>
-      <w:tr>
-        <w:tc>
-          <w:tcPr/>
-          <w:p>
-            <w:pPr>
-              <w:pStyle w:val="Compact"/>
-            </w:pPr>
-            <w:r>
-              <w:t xml:space="preserve">스코어링</w:t>
-            </w:r>
-          </w:p>
-        </w:tc>
-        <w:tc>
-          <w:tcPr/>
-          <w:p>
-            <w:pPr>
-              <w:pStyle w:val="Compact"/>
-            </w:pPr>
-            <w:r>
-              <w:t xml:space="preserve">daily ROAS prediction DAG</w:t>
-            </w:r>
-          </w:p>
-        </w:tc>
-      </w:tr>
-      <w:tr>
-        <w:tc>
-          <w:tcPr/>
-          <w:p>
-            <w:pPr>
-              <w:pStyle w:val="Compact"/>
-            </w:pPr>
-            <w:r>
-              <w:t xml:space="preserve">API 테스트</w:t>
-            </w:r>
-          </w:p>
-        </w:tc>
-        <w:tc>
-          <w:tcPr/>
-          <w:p>
-            <w:pPr>
-              <w:pStyle w:val="Compact"/>
-            </w:pPr>
-            <w:r>
-              <w:t xml:space="preserve">FastAPI unit tests</w:t>
-            </w:r>
-          </w:p>
-        </w:tc>
-      </w:tr>
-      <w:tr>
-        <w:tc>
-          <w:tcPr/>
-          <w:p>
-            <w:pPr>
-              <w:pStyle w:val="Compact"/>
-            </w:pPr>
-            <w:r>
-              <w:t xml:space="preserve">Text2SQL 평가</w:t>
-            </w:r>
-          </w:p>
-        </w:tc>
-        <w:tc>
-          <w:tcPr/>
-          <w:p>
-            <w:pPr>
-              <w:pStyle w:val="Compact"/>
-            </w:pPr>
-            <w:r>
-              <w:t xml:space="preserve">positive expected-SQL set + negative/content-safety set</w:t>
-            </w:r>
-          </w:p>
-        </w:tc>
-      </w:tr>
-      <w:tr>
-        <w:tc>
-          <w:tcPr/>
-          <w:p>
-            <w:pPr>
-              <w:pStyle w:val="Compact"/>
-            </w:pPr>
-            <w:r>
-              <w:t xml:space="preserve">CI</w:t>
-            </w:r>
-          </w:p>
-        </w:tc>
-        <w:tc>
-          <w:tcPr/>
-          <w:p>
-            <w:pPr>
-              <w:pStyle w:val="Compact"/>
-            </w:pPr>
-            <w:r>
-              <w:t xml:space="preserve">GitHub Actions</w:t>
+              <w:t xml:space="preserve">성과 지표</w:t>
+            </w:r>
+          </w:p>
+        </w:tc>
+        <w:tc>
+          <w:tcPr/>
+          <w:p>
+            <w:pPr>
+              <w:pStyle w:val="Compact"/>
+            </w:pPr>
+            <w:r>
+              <w:t xml:space="preserve">채용자가 이해할 수 있는 의미</w:t>
+            </w:r>
+          </w:p>
+        </w:tc>
+      </w:tr>
+      <w:tr>
+        <w:tc>
+          <w:tcPr/>
+          <w:p>
+            <w:pPr>
+              <w:pStyle w:val="Compact"/>
+            </w:pPr>
+            <w:r>
+              <w:rPr>
+                <w:rStyle w:val="VerbatimChar"/>
+              </w:rPr>
+              <w:t xml:space="preserve">1,725</w:t>
+            </w:r>
+            <w:r>
+              <w:t xml:space="preserve">건 수집,</w:t>
             </w:r>
             <w:r>
               <w:t xml:space="preserve"> </w:t>
@@ -2083,92 +3456,263 @@
               <w:rPr>
                 <w:rStyle w:val="VerbatimChar"/>
               </w:rPr>
-              <w:t xml:space="preserve">ruff</w:t>
+              <w:t xml:space="preserve">1,410</w:t>
+            </w:r>
+            <w:r>
+              <w:t xml:space="preserve">건 신규 적재</w:t>
+            </w:r>
+          </w:p>
+        </w:tc>
+        <w:tc>
+          <w:tcPr/>
+          <w:p>
+            <w:pPr>
+              <w:pStyle w:val="Compact"/>
+            </w:pPr>
+            <w:r>
+              <w:t xml:space="preserve">Airflow daily DAG가 실제 수집 작업을 수행하고, 신규 데이터와 기존 데이터를 구분해 적재한 증거</w:t>
+            </w:r>
+          </w:p>
+        </w:tc>
+      </w:tr>
+      <w:tr>
+        <w:tc>
+          <w:tcPr/>
+          <w:p>
+            <w:pPr>
+              <w:pStyle w:val="Compact"/>
+            </w:pPr>
+            <w:r>
+              <w:t xml:space="preserve">synthetic payment</w:t>
             </w:r>
             <w:r>
               <w:t xml:space="preserve"> </w:t>
             </w:r>
             <w:r>
-              <w:t xml:space="preserve">+</w:t>
+              <w:rPr>
+                <w:rStyle w:val="VerbatimChar"/>
+              </w:rPr>
+              <w:t xml:space="preserve">498</w:t>
             </w:r>
             <w:r>
               <w:t xml:space="preserve"> </w:t>
             </w:r>
             <w:r>
-              <w:rPr>
-                <w:rStyle w:val="VerbatimChar"/>
-              </w:rPr>
-              <w:t xml:space="preserve">pytest</w:t>
+              <w:t xml:space="preserve">events</w:t>
+            </w:r>
+          </w:p>
+        </w:tc>
+        <w:tc>
+          <w:tcPr/>
+          <w:p>
+            <w:pPr>
+              <w:pStyle w:val="Compact"/>
+            </w:pPr>
+            <w:r>
+              <w:t xml:space="preserve">실제 결제 데이터를 공개하지 않고도 campaign ROI mart, feature table, prediction monitor를 검증할 수 있는 benchmark 데이터셋을 만든 것</w:t>
+            </w:r>
+          </w:p>
+        </w:tc>
+      </w:tr>
+      <w:tr>
+        <w:tc>
+          <w:tcPr/>
+          <w:p>
+            <w:pPr>
+              <w:pStyle w:val="Compact"/>
+            </w:pPr>
+            <w:r>
+              <w:t xml:space="preserve">campaign ROI mart</w:t>
+            </w:r>
+            <w:r>
+              <w:t xml:space="preserve"> </w:t>
+            </w:r>
+            <w:r>
+              <w:rPr>
+                <w:rStyle w:val="VerbatimChar"/>
+              </w:rPr>
+              <w:t xml:space="preserve">30</w:t>
+            </w:r>
+            <w:r>
+              <w:t xml:space="preserve"> </w:t>
+            </w:r>
+            <w:r>
+              <w:t xml:space="preserve">rows</w:t>
+            </w:r>
+          </w:p>
+        </w:tc>
+        <w:tc>
+          <w:tcPr/>
+          <w:p>
+            <w:pPr>
+              <w:pStyle w:val="Compact"/>
+            </w:pPr>
+            <w:r>
+              <w:t xml:space="preserve">캠페인 단위 grain을 명확히 정의해 BI와 API가 같은 지표를 보도록 만든 것</w:t>
+            </w:r>
+          </w:p>
+        </w:tc>
+      </w:tr>
+      <w:tr>
+        <w:tc>
+          <w:tcPr/>
+          <w:p>
+            <w:pPr>
+              <w:pStyle w:val="Compact"/>
+            </w:pPr>
+            <w:r>
+              <w:t xml:space="preserve">prediction monitor MAE</w:t>
+            </w:r>
+            <w:r>
+              <w:t xml:space="preserve"> </w:t>
+            </w:r>
+            <w:r>
+              <w:rPr>
+                <w:rStyle w:val="VerbatimChar"/>
+              </w:rPr>
+              <w:t xml:space="preserve">0.0799</w:t>
+            </w:r>
+            <w:r>
+              <w:t xml:space="preserve">, bias</w:t>
+            </w:r>
+            <w:r>
+              <w:t xml:space="preserve"> </w:t>
+            </w:r>
+            <w:r>
+              <w:rPr>
+                <w:rStyle w:val="VerbatimChar"/>
+              </w:rPr>
+              <w:t xml:space="preserve">0.0000</w:t>
+            </w:r>
+          </w:p>
+        </w:tc>
+        <w:tc>
+          <w:tcPr/>
+          <w:p>
+            <w:pPr>
+              <w:pStyle w:val="Compact"/>
+            </w:pPr>
+            <w:r>
+              <w:t xml:space="preserve">모델 예측 결과를 dashboard에서 운영 지표처럼 모니터링할 수 있게 만든 것</w:t>
+            </w:r>
+          </w:p>
+        </w:tc>
+      </w:tr>
+      <w:tr>
+        <w:tc>
+          <w:tcPr/>
+          <w:p>
+            <w:pPr>
+              <w:pStyle w:val="Compact"/>
+            </w:pPr>
+            <w:r>
+              <w:t xml:space="preserve">ROAS MAE</w:t>
+            </w:r>
+            <w:r>
+              <w:t xml:space="preserve"> </w:t>
+            </w:r>
+            <w:r>
+              <w:rPr>
+                <w:rStyle w:val="VerbatimChar"/>
+              </w:rPr>
+              <w:t xml:space="preserve">0.0892 -&gt; 0.0474</w:t>
+            </w:r>
+          </w:p>
+        </w:tc>
+        <w:tc>
+          <w:tcPr/>
+          <w:p>
+            <w:pPr>
+              <w:pStyle w:val="Compact"/>
+            </w:pPr>
+            <w:r>
+              <w:t xml:space="preserve">단순 baseline보다 나은 benchmark model을 고르고, 그 결과를 artifact로 저장해 API serving까지 연결한 것</w:t>
+            </w:r>
+          </w:p>
+        </w:tc>
+      </w:tr>
+      <w:tr>
+        <w:tc>
+          <w:tcPr/>
+          <w:p>
+            <w:pPr>
+              <w:pStyle w:val="Compact"/>
+            </w:pPr>
+            <w:r>
+              <w:t xml:space="preserve">expected-SQL</w:t>
+            </w:r>
+            <w:r>
+              <w:t xml:space="preserve"> </w:t>
+            </w:r>
+            <w:r>
+              <w:rPr>
+                <w:rStyle w:val="VerbatimChar"/>
+              </w:rPr>
+              <w:t xml:space="preserve">24/24 PASS</w:t>
+            </w:r>
+          </w:p>
+        </w:tc>
+        <w:tc>
+          <w:tcPr/>
+          <w:p>
+            <w:pPr>
+              <w:pStyle w:val="Compact"/>
+            </w:pPr>
+            <w:r>
+              <w:t xml:space="preserve">자연어 질문을 검증된 SQL 기준선으로 평가할 수 있는 regression baseline을 만든 것</w:t>
+            </w:r>
+          </w:p>
+        </w:tc>
+      </w:tr>
+      <w:tr>
+        <w:tc>
+          <w:tcPr/>
+          <w:p>
+            <w:pPr>
+              <w:pStyle w:val="Compact"/>
+            </w:pPr>
+            <w:r>
+              <w:t xml:space="preserve">OpenAI/Gemini eval 결과</w:t>
+            </w:r>
+          </w:p>
+        </w:tc>
+        <w:tc>
+          <w:tcPr/>
+          <w:p>
+            <w:pPr>
+              <w:pStyle w:val="Compact"/>
+            </w:pPr>
+            <w:r>
+              <w:t xml:space="preserve">LLM을 단순 호출하지 않고 provider별 정확도, 안전성, 비용 차이를 같은 기준으로 비교한 것</w:t>
+            </w:r>
+          </w:p>
+        </w:tc>
+      </w:tr>
+      <w:tr>
+        <w:tc>
+          <w:tcPr/>
+          <w:p>
+            <w:pPr>
+              <w:pStyle w:val="Compact"/>
+            </w:pPr>
+            <w:r>
+              <w:t xml:space="preserve">provider cost comparison</w:t>
+            </w:r>
+          </w:p>
+        </w:tc>
+        <w:tc>
+          <w:tcPr/>
+          <w:p>
+            <w:pPr>
+              <w:pStyle w:val="Compact"/>
+            </w:pPr>
+            <w:r>
+              <w:t xml:space="preserve">모델 선택을 감이 아니라 request-level cost/latency 관측값으로 설명할 수 있게 만든 것</w:t>
             </w:r>
           </w:p>
         </w:tc>
       </w:tr>
     </w:tbl>
-    <w:p>
-      <w:pPr>
-        <w:pStyle w:val="BodyText"/>
-      </w:pPr>
-      <w:r>
-        <w:t xml:space="preserve">최신 문서화된 품질 게이트:</w:t>
-      </w:r>
-    </w:p>
-    <w:p>
-      <w:pPr>
-        <w:pStyle w:val="Compact"/>
-        <w:numPr>
-          <w:ilvl w:val="0"/>
-          <w:numId w:val="1004"/>
-        </w:numPr>
-      </w:pPr>
-      <w:r>
-        <w:rPr>
-          <w:rStyle w:val="VerbatimChar"/>
-        </w:rPr>
-        <w:t xml:space="preserve">ruff</w:t>
-      </w:r>
-      <w:r>
-        <w:t xml:space="preserve"> </w:t>
-      </w:r>
-      <w:r>
-        <w:t xml:space="preserve">pass</w:t>
-      </w:r>
-    </w:p>
-    <w:p>
-      <w:pPr>
-        <w:pStyle w:val="Compact"/>
-        <w:numPr>
-          <w:ilvl w:val="0"/>
-          <w:numId w:val="1004"/>
-        </w:numPr>
-      </w:pPr>
-      <w:r>
-        <w:rPr>
-          <w:rStyle w:val="VerbatimChar"/>
-        </w:rPr>
-        <w:t xml:space="preserve">pytest 82 passed</w:t>
-      </w:r>
-    </w:p>
-    <w:p>
-      <w:pPr>
-        <w:pStyle w:val="Compact"/>
-        <w:numPr>
-          <w:ilvl w:val="0"/>
-          <w:numId w:val="1004"/>
-        </w:numPr>
-      </w:pPr>
-      <w:r>
-        <w:rPr>
-          <w:rStyle w:val="VerbatimChar"/>
-        </w:rPr>
-        <w:t xml:space="preserve">git diff --check</w:t>
-      </w:r>
-      <w:r>
-        <w:t xml:space="preserve"> </w:t>
-      </w:r>
-      <w:r>
-        <w:t xml:space="preserve">pass</w:t>
-      </w:r>
-    </w:p>
     <w:p>
       <w:r>
         <w:pict>
@@ -2176,510 +3720,18 @@
         </w:pict>
       </w:r>
     </w:p>
-    <w:bookmarkEnd w:id="20"/>
-    <w:bookmarkStart w:id="21" w:name="주요-성과-지표"/>
+    <w:bookmarkEnd w:id="23"/>
+    <w:bookmarkEnd w:id="24"/>
+    <w:bookmarkStart w:id="28" w:name="api와-text2sql"/>
     <w:p>
       <w:pPr>
         <w:pStyle w:val="Heading2"/>
       </w:pPr>
       <w:r>
-        <w:t xml:space="preserve">7. 주요 성과 지표</w:t>
-      </w:r>
-    </w:p>
-    <w:tbl>
-      <w:tblPr>
-        <w:tblStyle w:val="Table"/>
-        <w:tblW w:type="pct" w:w="5000"/>
-        <w:tblLayout w:type="fixed"/>
-        <w:tblLook w:firstRow="1" w:lastRow="0" w:firstColumn="0" w:lastColumn="0" w:noHBand="0" w:noVBand="0" w:val="0020"/>
-      </w:tblPr>
-      <w:tblGrid>
-        <w:gridCol w:w="3394"/>
-        <w:gridCol w:w="4525"/>
-      </w:tblGrid>
-      <w:tr>
-        <w:trPr>
-          <w:tblHeader w:val="on"/>
-        </w:trPr>
-        <w:tc>
-          <w:tcPr/>
-          <w:p>
-            <w:pPr>
-              <w:pStyle w:val="Compact"/>
-            </w:pPr>
-            <w:r>
-              <w:t xml:space="preserve">영역</w:t>
-            </w:r>
-          </w:p>
-        </w:tc>
-        <w:tc>
-          <w:tcPr/>
-          <w:p>
-            <w:pPr>
-              <w:pStyle w:val="Compact"/>
-              <w:jc w:val="right"/>
-            </w:pPr>
-            <w:r>
-              <w:t xml:space="preserve">결과</w:t>
-            </w:r>
-          </w:p>
-        </w:tc>
-      </w:tr>
-      <w:tr>
-        <w:tc>
-          <w:tcPr/>
-          <w:p>
-            <w:pPr>
-              <w:pStyle w:val="Compact"/>
-            </w:pPr>
-            <w:r>
-              <w:t xml:space="preserve">Phase 2B daily adaptive run</w:t>
-            </w:r>
-          </w:p>
-        </w:tc>
-        <w:tc>
-          <w:tcPr/>
-          <w:p>
-            <w:pPr>
-              <w:pStyle w:val="Compact"/>
-              <w:jc w:val="right"/>
-            </w:pPr>
-            <w:r>
-              <w:rPr>
-                <w:rStyle w:val="VerbatimChar"/>
-              </w:rPr>
-              <w:t xml:space="preserve">items_collected_total=1725</w:t>
-            </w:r>
-            <w:r>
-              <w:t xml:space="preserve">,</w:t>
-            </w:r>
-            <w:r>
-              <w:t xml:space="preserve"> </w:t>
-            </w:r>
-            <w:r>
-              <w:rPr>
-                <w:rStyle w:val="VerbatimChar"/>
-              </w:rPr>
-              <w:t xml:space="preserve">inserted_total=1410</w:t>
-            </w:r>
-          </w:p>
-        </w:tc>
-      </w:tr>
-      <w:tr>
-        <w:tc>
-          <w:tcPr/>
-          <w:p>
-            <w:pPr>
-              <w:pStyle w:val="Compact"/>
-            </w:pPr>
-            <w:r>
-              <w:t xml:space="preserve">Synthetic payment benchmark</w:t>
-            </w:r>
-          </w:p>
-        </w:tc>
-        <w:tc>
-          <w:tcPr/>
-          <w:p>
-            <w:pPr>
-              <w:pStyle w:val="Compact"/>
-              <w:jc w:val="right"/>
-            </w:pPr>
-            <w:r>
-              <w:rPr>
-                <w:rStyle w:val="VerbatimChar"/>
-              </w:rPr>
-              <w:t xml:space="preserve">498</w:t>
-            </w:r>
-            <w:r>
-              <w:t xml:space="preserve"> </w:t>
-            </w:r>
-            <w:r>
-              <w:t xml:space="preserve">payment events</w:t>
-            </w:r>
-          </w:p>
-        </w:tc>
-      </w:tr>
-      <w:tr>
-        <w:tc>
-          <w:tcPr/>
-          <w:p>
-            <w:pPr>
-              <w:pStyle w:val="Compact"/>
-            </w:pPr>
-            <w:r>
-              <w:t xml:space="preserve">Synthetic net payment</w:t>
-            </w:r>
-          </w:p>
-        </w:tc>
-        <w:tc>
-          <w:tcPr/>
-          <w:p>
-            <w:pPr>
-              <w:pStyle w:val="Compact"/>
-              <w:jc w:val="right"/>
-            </w:pPr>
-            <w:r>
-              <w:t xml:space="preserve">KRW</w:t>
-            </w:r>
-            <w:r>
-              <w:t xml:space="preserve"> </w:t>
-            </w:r>
-            <w:r>
-              <w:rPr>
-                <w:rStyle w:val="VerbatimChar"/>
-              </w:rPr>
-              <w:t xml:space="preserve">6,329,923.59</w:t>
-            </w:r>
-          </w:p>
-        </w:tc>
-      </w:tr>
-      <w:tr>
-        <w:tc>
-          <w:tcPr/>
-          <w:p>
-            <w:pPr>
-              <w:pStyle w:val="Compact"/>
-            </w:pPr>
-            <w:r>
-              <w:t xml:space="preserve">Campaign ROI mart</w:t>
-            </w:r>
-          </w:p>
-        </w:tc>
-        <w:tc>
-          <w:tcPr/>
-          <w:p>
-            <w:pPr>
-              <w:pStyle w:val="Compact"/>
-              <w:jc w:val="right"/>
-            </w:pPr>
-            <w:r>
-              <w:rPr>
-                <w:rStyle w:val="VerbatimChar"/>
-              </w:rPr>
-              <w:t xml:space="preserve">30</w:t>
-            </w:r>
-            <w:r>
-              <w:t xml:space="preserve"> </w:t>
-            </w:r>
-            <w:r>
-              <w:t xml:space="preserve">campaign rows, max ROAS</w:t>
-            </w:r>
-            <w:r>
-              <w:t xml:space="preserve"> </w:t>
-            </w:r>
-            <w:r>
-              <w:rPr>
-                <w:rStyle w:val="VerbatimChar"/>
-              </w:rPr>
-              <w:t xml:space="preserve">0.5969</w:t>
-            </w:r>
-          </w:p>
-        </w:tc>
-      </w:tr>
-      <w:tr>
-        <w:tc>
-          <w:tcPr/>
-          <w:p>
-            <w:pPr>
-              <w:pStyle w:val="Compact"/>
-            </w:pPr>
-            <w:r>
-              <w:t xml:space="preserve">Prediction monitor</w:t>
-            </w:r>
-          </w:p>
-        </w:tc>
-        <w:tc>
-          <w:tcPr/>
-          <w:p>
-            <w:pPr>
-              <w:pStyle w:val="Compact"/>
-              <w:jc w:val="right"/>
-            </w:pPr>
-            <w:r>
-              <w:rPr>
-                <w:rStyle w:val="VerbatimChar"/>
-              </w:rPr>
-              <w:t xml:space="preserve">25</w:t>
-            </w:r>
-            <w:r>
-              <w:t xml:space="preserve"> </w:t>
-            </w:r>
-            <w:r>
-              <w:t xml:space="preserve">rows, MAE</w:t>
-            </w:r>
-            <w:r>
-              <w:t xml:space="preserve"> </w:t>
-            </w:r>
-            <w:r>
-              <w:rPr>
-                <w:rStyle w:val="VerbatimChar"/>
-              </w:rPr>
-              <w:t xml:space="preserve">0.0799</w:t>
-            </w:r>
-            <w:r>
-              <w:t xml:space="preserve">, bias</w:t>
-            </w:r>
-            <w:r>
-              <w:t xml:space="preserve"> </w:t>
-            </w:r>
-            <w:r>
-              <w:rPr>
-                <w:rStyle w:val="VerbatimChar"/>
-              </w:rPr>
-              <w:t xml:space="preserve">0.0000</w:t>
-            </w:r>
-          </w:p>
-        </w:tc>
-      </w:tr>
-      <w:tr>
-        <w:tc>
-          <w:tcPr/>
-          <w:p>
-            <w:pPr>
-              <w:pStyle w:val="Compact"/>
-            </w:pPr>
-            <w:r>
-              <w:t xml:space="preserve">ROAS model comparison</w:t>
-            </w:r>
-          </w:p>
-        </w:tc>
-        <w:tc>
-          <w:tcPr/>
-          <w:p>
-            <w:pPr>
-              <w:pStyle w:val="Compact"/>
-              <w:jc w:val="right"/>
-            </w:pPr>
-            <w:r>
-              <w:t xml:space="preserve">baseline MAE</w:t>
-            </w:r>
-            <w:r>
-              <w:t xml:space="preserve"> </w:t>
-            </w:r>
-            <w:r>
-              <w:rPr>
-                <w:rStyle w:val="VerbatimChar"/>
-              </w:rPr>
-              <w:t xml:space="preserve">0.0892</w:t>
-            </w:r>
-            <w:r>
-              <w:t xml:space="preserve"> </w:t>
-            </w:r>
-            <w:r>
-              <w:t xml:space="preserve">-&gt; linear model MAE</w:t>
-            </w:r>
-            <w:r>
-              <w:t xml:space="preserve"> </w:t>
-            </w:r>
-            <w:r>
-              <w:rPr>
-                <w:rStyle w:val="VerbatimChar"/>
-              </w:rPr>
-              <w:t xml:space="preserve">0.0474</w:t>
-            </w:r>
-          </w:p>
-        </w:tc>
-      </w:tr>
-      <w:tr>
-        <w:tc>
-          <w:tcPr/>
-          <w:p>
-            <w:pPr>
-              <w:pStyle w:val="Compact"/>
-            </w:pPr>
-            <w:r>
-              <w:t xml:space="preserve">deterministic Text2SQL baseline</w:t>
-            </w:r>
-          </w:p>
-        </w:tc>
-        <w:tc>
-          <w:tcPr/>
-          <w:p>
-            <w:pPr>
-              <w:pStyle w:val="Compact"/>
-              <w:jc w:val="right"/>
-            </w:pPr>
-            <w:r>
-              <w:t xml:space="preserve">expected-SQL registry</w:t>
-            </w:r>
-            <w:r>
-              <w:t xml:space="preserve"> </w:t>
-            </w:r>
-            <w:r>
-              <w:rPr>
-                <w:rStyle w:val="VerbatimChar"/>
-              </w:rPr>
-              <w:t xml:space="preserve">24/24 PASS</w:t>
-            </w:r>
-          </w:p>
-        </w:tc>
-      </w:tr>
-      <w:tr>
-        <w:tc>
-          <w:tcPr/>
-          <w:p>
-            <w:pPr>
-              <w:pStyle w:val="Compact"/>
-            </w:pPr>
-            <w:r>
-              <w:t xml:space="preserve">OpenAI Text2SQL eval</w:t>
-            </w:r>
-          </w:p>
-        </w:tc>
-        <w:tc>
-          <w:tcPr/>
-          <w:p>
-            <w:pPr>
-              <w:pStyle w:val="Compact"/>
-              <w:jc w:val="right"/>
-            </w:pPr>
-            <w:r>
-              <w:t xml:space="preserve">positive</w:t>
-            </w:r>
-            <w:r>
-              <w:t xml:space="preserve"> </w:t>
-            </w:r>
-            <w:r>
-              <w:rPr>
-                <w:rStyle w:val="VerbatimChar"/>
-              </w:rPr>
-              <w:t xml:space="preserve">24/24</w:t>
-            </w:r>
-            <w:r>
-              <w:t xml:space="preserve">, negative</w:t>
-            </w:r>
-            <w:r>
-              <w:t xml:space="preserve"> </w:t>
-            </w:r>
-            <w:r>
-              <w:rPr>
-                <w:rStyle w:val="VerbatimChar"/>
-              </w:rPr>
-              <w:t xml:space="preserve">14/14</w:t>
-            </w:r>
-          </w:p>
-        </w:tc>
-      </w:tr>
-      <w:tr>
-        <w:tc>
-          <w:tcPr/>
-          <w:p>
-            <w:pPr>
-              <w:pStyle w:val="Compact"/>
-            </w:pPr>
-            <w:r>
-              <w:t xml:space="preserve">Gemini Text2SQL eval</w:t>
-            </w:r>
-          </w:p>
-        </w:tc>
-        <w:tc>
-          <w:tcPr/>
-          <w:p>
-            <w:pPr>
-              <w:pStyle w:val="Compact"/>
-              <w:jc w:val="right"/>
-            </w:pPr>
-            <w:r>
-              <w:t xml:space="preserve">positive</w:t>
-            </w:r>
-            <w:r>
-              <w:t xml:space="preserve"> </w:t>
-            </w:r>
-            <w:r>
-              <w:rPr>
-                <w:rStyle w:val="VerbatimChar"/>
-              </w:rPr>
-              <w:t xml:space="preserve">24/24</w:t>
-            </w:r>
-            <w:r>
-              <w:t xml:space="preserve">, negative</w:t>
-            </w:r>
-            <w:r>
-              <w:t xml:space="preserve"> </w:t>
-            </w:r>
-            <w:r>
-              <w:rPr>
-                <w:rStyle w:val="VerbatimChar"/>
-              </w:rPr>
-              <w:t xml:space="preserve">12/14</w:t>
-            </w:r>
-          </w:p>
-        </w:tc>
-      </w:tr>
-      <w:tr>
-        <w:tc>
-          <w:tcPr/>
-          <w:p>
-            <w:pPr>
-              <w:pStyle w:val="Compact"/>
-            </w:pPr>
-            <w:r>
-              <w:t xml:space="preserve">Provider cost comparison</w:t>
-            </w:r>
-          </w:p>
-        </w:tc>
-        <w:tc>
-          <w:tcPr/>
-          <w:p>
-            <w:pPr>
-              <w:pStyle w:val="Compact"/>
-              <w:jc w:val="right"/>
-            </w:pPr>
-            <w:r>
-              <w:t xml:space="preserve">Gemini</w:t>
-            </w:r>
-            <w:r>
-              <w:t xml:space="preserve"> </w:t>
-            </w:r>
-            <w:r>
-              <w:rPr>
-                <w:rStyle w:val="VerbatimChar"/>
-              </w:rPr>
-              <w:t xml:space="preserve">$0.064098</w:t>
-            </w:r>
-            <w:r>
-              <w:t xml:space="preserve"> </w:t>
-            </w:r>
-            <w:r>
-              <w:t xml:space="preserve">vs OpenAI</w:t>
-            </w:r>
-            <w:r>
-              <w:t xml:space="preserve"> </w:t>
-            </w:r>
-            <w:r>
-              <w:rPr>
-                <w:rStyle w:val="VerbatimChar"/>
-              </w:rPr>
-              <w:t xml:space="preserve">$0.103027</w:t>
-            </w:r>
-            <w:r>
-              <w:t xml:space="preserve"> </w:t>
-            </w:r>
-            <w:r>
-              <w:t xml:space="preserve">over 38 cases</w:t>
-            </w:r>
-          </w:p>
-        </w:tc>
-      </w:tr>
-    </w:tbl>
-    <w:p>
-      <w:r>
-        <w:pict>
-          <v:rect style="width:0;height:1.5pt" o:hralign="center" o:hrstd="t" o:hr="t"/>
-        </w:pict>
-      </w:r>
-    </w:p>
-    <w:bookmarkEnd w:id="21"/>
-    <w:bookmarkStart w:id="25" w:name="api와-text2sql"/>
-    <w:p>
-      <w:pPr>
-        <w:pStyle w:val="Heading2"/>
-      </w:pPr>
-      <w:r>
-        <w:t xml:space="preserve">8. API와 Text2SQL</w:t>
-      </w:r>
-    </w:p>
-    <w:bookmarkStart w:id="22" w:name="fastapi-endpoints"/>
+        <w:t xml:space="preserve">9. API와 Text2SQL</w:t>
+      </w:r>
+    </w:p>
+    <w:bookmarkStart w:id="25" w:name="fastapi-endpoints"/>
     <w:p>
       <w:pPr>
         <w:pStyle w:val="Heading3"/>
@@ -2834,8 +3886,29 @@
         </w:tc>
       </w:tr>
     </w:tbl>
-    <w:bookmarkEnd w:id="22"/>
-    <w:bookmarkStart w:id="23" w:name="text2sql-guardrails"/>
+    <w:p>
+      <w:pPr>
+        <w:pStyle w:val="BodyText"/>
+      </w:pPr>
+      <w:r>
+        <w:t xml:space="preserve">이 섹션은 데이터 엔지니어링 본체라기보다</w:t>
+      </w:r>
+      <w:r>
+        <w:t xml:space="preserve"> </w:t>
+      </w:r>
+      <w:r>
+        <w:rPr>
+          <w:b/>
+          <w:bCs/>
+        </w:rPr>
+        <w:t xml:space="preserve">모델링된 데이터를 어떻게 안전하게 소비하게 만들었는지</w:t>
+      </w:r>
+      <w:r>
+        <w:t xml:space="preserve">를 보여주는 확장 영역입니다. 핵심 구현은 generated SQL을 무조건 신뢰하지 않고, 데이터 플랫폼의 table/column contract와 validator를 통해 통제하는 점입니다.</w:t>
+      </w:r>
+    </w:p>
+    <w:bookmarkEnd w:id="25"/>
+    <w:bookmarkStart w:id="26" w:name="text2sql-guardrails"/>
     <w:p>
       <w:pPr>
         <w:pStyle w:val="Heading3"/>
@@ -2942,8 +4015,8 @@
         <w:t xml:space="preserve">fallback reason tracking</w:t>
       </w:r>
     </w:p>
-    <w:bookmarkEnd w:id="23"/>
-    <w:bookmarkStart w:id="24" w:name="provider-strategy"/>
+    <w:bookmarkEnd w:id="26"/>
+    <w:bookmarkStart w:id="27" w:name="provider-strategy"/>
     <w:p>
       <w:pPr>
         <w:pStyle w:val="Heading3"/>
@@ -3067,7 +4140,7 @@
               <w:pStyle w:val="Compact"/>
             </w:pPr>
             <w:r>
-              <w:t xml:space="preserve">negative safety와 속도가 더 안정적</w:t>
+              <w:t xml:space="preserve">안전성 질의 평가와 속도가 더 안정적</w:t>
             </w:r>
           </w:p>
         </w:tc>
@@ -3115,15 +4188,15 @@
         </w:pict>
       </w:r>
     </w:p>
-    <w:bookmarkEnd w:id="24"/>
-    <w:bookmarkEnd w:id="25"/>
-    <w:bookmarkStart w:id="26" w:name="트러블슈팅과-설계-학습"/>
+    <w:bookmarkEnd w:id="27"/>
+    <w:bookmarkEnd w:id="28"/>
+    <w:bookmarkStart w:id="29" w:name="트러블슈팅과-설계-학습"/>
     <w:p>
       <w:pPr>
         <w:pStyle w:val="Heading2"/>
       </w:pPr>
       <w:r>
-        <w:t xml:space="preserve">9. 트러블슈팅과 설계 학습</w:t>
+        <w:t xml:space="preserve">10. 트러블슈팅과 설계 학습</w:t>
       </w:r>
     </w:p>
     <w:tbl>
@@ -3207,7 +4280,7 @@
               <w:pStyle w:val="Compact"/>
             </w:pPr>
             <w:r>
-              <w:t xml:space="preserve">validator, allowlist, timeout, refusal, negative eval 추가</w:t>
+              <w:t xml:space="preserve">validator, allowlist, timeout, refusal, 안전성 질의 평가 추가</w:t>
             </w:r>
           </w:p>
         </w:tc>
@@ -3304,17 +4377,17 @@
         </w:pict>
       </w:r>
     </w:p>
-    <w:bookmarkEnd w:id="26"/>
-    <w:bookmarkStart w:id="29" w:name="한계와-후속-개선"/>
+    <w:bookmarkEnd w:id="29"/>
+    <w:bookmarkStart w:id="32" w:name="한계와-후속-개선"/>
     <w:p>
       <w:pPr>
         <w:pStyle w:val="Heading2"/>
       </w:pPr>
       <w:r>
-        <w:t xml:space="preserve">10. 한계와 후속 개선</w:t>
-      </w:r>
-    </w:p>
-    <w:bookmarkStart w:id="27" w:name="한계"/>
+        <w:t xml:space="preserve">11. 한계와 후속 개선</w:t>
+      </w:r>
+    </w:p>
+    <w:bookmarkStart w:id="30" w:name="한계"/>
     <w:p>
       <w:pPr>
         <w:pStyle w:val="Heading3"/>
@@ -3377,8 +4450,8 @@
         <w:t xml:space="preserve">는 validation과 fallback을 갖췄지만, 운영 API로 쓰려면 auth, rate limit, tenant boundary, larger traffic measurement가 필요하다.</w:t>
       </w:r>
     </w:p>
-    <w:bookmarkEnd w:id="27"/>
-    <w:bookmarkStart w:id="28" w:name="후속-개선"/>
+    <w:bookmarkEnd w:id="30"/>
+    <w:bookmarkStart w:id="31" w:name="후속-개선"/>
     <w:p>
       <w:pPr>
         <w:pStyle w:val="Heading3"/>
@@ -3463,15 +4536,15 @@
         </w:pict>
       </w:r>
     </w:p>
-    <w:bookmarkEnd w:id="28"/>
-    <w:bookmarkEnd w:id="29"/>
-    <w:bookmarkStart w:id="30" w:name="제출-시-요약-문장"/>
+    <w:bookmarkEnd w:id="31"/>
+    <w:bookmarkEnd w:id="32"/>
+    <w:bookmarkStart w:id="33" w:name="면접-질문-유도-포인트"/>
     <w:p>
       <w:pPr>
         <w:pStyle w:val="Heading2"/>
       </w:pPr>
       <w:r>
-        <w:t xml:space="preserve">11. 제출 시 요약 문장</w:t>
+        <w:t xml:space="preserve">12. 면접 질문 유도 포인트</w:t>
       </w:r>
     </w:p>
     <w:p>
@@ -3479,17 +4552,216 @@
         <w:pStyle w:val="FirstParagraph"/>
       </w:pPr>
       <w:r>
-        <w:t xml:space="preserve">지원서 프로젝트 설명란에는 아래 문장을 사용한다.</w:t>
-      </w:r>
-    </w:p>
-    <w:p>
-      <w:pPr>
-        <w:pStyle w:val="BlockText"/>
-      </w:pPr>
-      <w:r>
-        <w:t xml:space="preserve">Airflow, Postgres, dbt, Superset, FastAPI로 인플루언서 광고 수집 데이터와 합성 결제 이벤트를 campaign ROI/ROAS 분석 플랫폼으로 모델링했습니다. ROAS model comparison과 artifact-backed serving을 구현했고, Text2SQL API는 expected-SQL baseline, SQL validator, provider gateway, OpenAI/Gemini fallback, request-level cost/latency observability까지 포함해 평가했습니다.</w:t>
-      </w:r>
-    </w:p>
+        <w:t xml:space="preserve">면접관이 아래 질문을 던지면, 이 프로젝트의 설계 의도를 가장 잘 설명할 수 있습니다.</w:t>
+      </w:r>
+    </w:p>
+    <w:tbl>
+      <w:tblPr>
+        <w:tblStyle w:val="Table"/>
+        <w:tblW w:type="pct" w:w="5000"/>
+        <w:tblLayout w:type="fixed"/>
+        <w:tblLook w:firstRow="1" w:lastRow="0" w:firstColumn="0" w:lastColumn="0" w:noHBand="0" w:noVBand="0" w:val="0020"/>
+      </w:tblPr>
+      <w:tblGrid>
+        <w:gridCol w:w="3960"/>
+        <w:gridCol w:w="3960"/>
+      </w:tblGrid>
+      <w:tr>
+        <w:trPr>
+          <w:tblHeader w:val="on"/>
+        </w:trPr>
+        <w:tc>
+          <w:tcPr/>
+          <w:p>
+            <w:pPr>
+              <w:pStyle w:val="Compact"/>
+            </w:pPr>
+            <w:r>
+              <w:t xml:space="preserve">예상 질문</w:t>
+            </w:r>
+          </w:p>
+        </w:tc>
+        <w:tc>
+          <w:tcPr/>
+          <w:p>
+            <w:pPr>
+              <w:pStyle w:val="Compact"/>
+            </w:pPr>
+            <w:r>
+              <w:t xml:space="preserve">답변 방향</w:t>
+            </w:r>
+          </w:p>
+        </w:tc>
+      </w:tr>
+      <w:tr>
+        <w:tc>
+          <w:tcPr/>
+          <w:p>
+            <w:pPr>
+              <w:pStyle w:val="Compact"/>
+            </w:pPr>
+            <w:r>
+              <w:t xml:space="preserve">왜 raw 데이터를 그대로 보존했나요?</w:t>
+            </w:r>
+          </w:p>
+        </w:tc>
+        <w:tc>
+          <w:tcPr/>
+          <w:p>
+            <w:pPr>
+              <w:pStyle w:val="Compact"/>
+            </w:pPr>
+            <w:r>
+              <w:t xml:space="preserve">raw는 외부 입력 증거이고, downstream 로직 변경 시 staging 이후를 재빌드할 수 있기 때문입니다.</w:t>
+            </w:r>
+          </w:p>
+        </w:tc>
+      </w:tr>
+      <w:tr>
+        <w:tc>
+          <w:tcPr/>
+          <w:p>
+            <w:pPr>
+              <w:pStyle w:val="Compact"/>
+            </w:pPr>
+            <w:r>
+              <w:t xml:space="preserve">왜 합성 결제 데이터를 사용했나요?</w:t>
+            </w:r>
+          </w:p>
+        </w:tc>
+        <w:tc>
+          <w:tcPr/>
+          <w:p>
+            <w:pPr>
+              <w:pStyle w:val="Compact"/>
+            </w:pPr>
+            <w:r>
+              <w:t xml:space="preserve">실제 결제 데이터는 민감하므로 공개 포트폴리오에서는 synthetic benchmark로 pipeline/modeling/serving pattern을 검증했습니다.</w:t>
+            </w:r>
+          </w:p>
+        </w:tc>
+      </w:tr>
+      <w:tr>
+        <w:tc>
+          <w:tcPr/>
+          <w:p>
+            <w:pPr>
+              <w:pStyle w:val="Compact"/>
+            </w:pPr>
+            <w:r>
+              <w:t xml:space="preserve">왜 복잡한 모델 대신 simple model을 썼나요?</w:t>
+            </w:r>
+          </w:p>
+        </w:tc>
+        <w:tc>
+          <w:tcPr/>
+          <w:p>
+            <w:pPr>
+              <w:pStyle w:val="Compact"/>
+            </w:pPr>
+            <w:r>
+              <w:t xml:space="preserve">labeled row가 25개뿐이라 복잡한 모델 성능을 주장하는 것보다 leave-one-out simple model 비교가 더 방어 가능했습니다.</w:t>
+            </w:r>
+          </w:p>
+        </w:tc>
+      </w:tr>
+      <w:tr>
+        <w:tc>
+          <w:tcPr/>
+          <w:p>
+            <w:pPr>
+              <w:pStyle w:val="Compact"/>
+            </w:pPr>
+            <w:r>
+              <w:t xml:space="preserve">dbt 모델 grain은 어떻게 정했나요?</w:t>
+            </w:r>
+          </w:p>
+        </w:tc>
+        <w:tc>
+          <w:tcPr/>
+          <w:p>
+            <w:pPr>
+              <w:pStyle w:val="Compact"/>
+            </w:pPr>
+            <w:r>
+              <w:t xml:space="preserve">campaign ROI는 campaign grain, prediction monitor는 campaign scoring snapshot grain으로 분리해 BI/API 해석이 흔들리지 않게 했습니다.</w:t>
+            </w:r>
+          </w:p>
+        </w:tc>
+      </w:tr>
+      <w:tr>
+        <w:tc>
+          <w:tcPr/>
+          <w:p>
+            <w:pPr>
+              <w:pStyle w:val="Compact"/>
+            </w:pPr>
+            <w:r>
+              <w:t xml:space="preserve">generated SQL hallucination은 어떻게 막았나요?</w:t>
+            </w:r>
+          </w:p>
+        </w:tc>
+        <w:tc>
+          <w:tcPr/>
+          <w:p>
+            <w:pPr>
+              <w:pStyle w:val="Compact"/>
+            </w:pPr>
+            <w:r>
+              <w:rPr>
+                <w:rStyle w:val="VerbatimChar"/>
+              </w:rPr>
+              <w:t xml:space="preserve">/query</w:t>
+            </w:r>
+            <w:r>
+              <w:t xml:space="preserve"> </w:t>
+            </w:r>
+            <w:r>
+              <w:t xml:space="preserve">baseline,</w:t>
+            </w:r>
+            <w:r>
+              <w:t xml:space="preserve"> </w:t>
+            </w:r>
+            <w:r>
+              <w:rPr>
+                <w:rStyle w:val="VerbatimChar"/>
+              </w:rPr>
+              <w:t xml:space="preserve">/query/v2</w:t>
+            </w:r>
+            <w:r>
+              <w:t xml:space="preserve"> </w:t>
+            </w:r>
+            <w:r>
+              <w:t xml:space="preserve">validator, table/column allowlist, timeout, 안전성 질의 평가, audit log로 실행 경계를 만들었습니다.</w:t>
+            </w:r>
+          </w:p>
+        </w:tc>
+      </w:tr>
+      <w:tr>
+        <w:tc>
+          <w:tcPr/>
+          <w:p>
+            <w:pPr>
+              <w:pStyle w:val="Compact"/>
+            </w:pPr>
+            <w:r>
+              <w:t xml:space="preserve">AWS로 옮긴다면 무엇이 바뀌나요?</w:t>
+            </w:r>
+          </w:p>
+        </w:tc>
+        <w:tc>
+          <w:tcPr/>
+          <w:p>
+            <w:pPr>
+              <w:pStyle w:val="Compact"/>
+            </w:pPr>
+            <w:r>
+              <w:t xml:space="preserve">Airflow는 MWAA, Postgres는 RDS/Aurora 또는 Redshift, FastAPI는 ECS Fargate + ALB, logs는 CloudWatch로 대응합니다.</w:t>
+            </w:r>
+          </w:p>
+        </w:tc>
+      </w:tr>
+    </w:tbl>
     <w:p>
       <w:r>
         <w:pict>
@@ -3497,14 +4769,47 @@
         </w:pict>
       </w:r>
     </w:p>
-    <w:bookmarkEnd w:id="30"/>
-    <w:bookmarkStart w:id="31" w:name="조사-기준"/>
+    <w:bookmarkEnd w:id="33"/>
+    <w:bookmarkStart w:id="34" w:name="제출-시-요약-문장"/>
     <w:p>
       <w:pPr>
         <w:pStyle w:val="Heading2"/>
       </w:pPr>
       <w:r>
-        <w:t xml:space="preserve">12. 조사 기준</w:t>
+        <w:t xml:space="preserve">13. 제출 시 요약 문장</w:t>
+      </w:r>
+    </w:p>
+    <w:p>
+      <w:pPr>
+        <w:pStyle w:val="FirstParagraph"/>
+      </w:pPr>
+      <w:r>
+        <w:t xml:space="preserve">지원서 프로젝트 설명란에는 아래 문장을 사용한다.</w:t>
+      </w:r>
+    </w:p>
+    <w:p>
+      <w:pPr>
+        <w:pStyle w:val="BlockText"/>
+      </w:pPr>
+      <w:r>
+        <w:t xml:space="preserve">Airflow, Postgres, dbt, Superset, FastAPI로 인플루언서 광고 수집 데이터와 합성 결제 이벤트를 campaign ROI/ROAS 분석 플랫폼으로 모델링했습니다. ROAS model comparison과 artifact-backed serving을 구현했고, Text2SQL API는 expected-SQL baseline, SQL validator, provider gateway, OpenAI/Gemini fallback, request-level cost/latency observability까지 포함해 평가했습니다.</w:t>
+      </w:r>
+    </w:p>
+    <w:p>
+      <w:r>
+        <w:pict>
+          <v:rect style="width:0;height:1.5pt" o:hralign="center" o:hrstd="t" o:hr="t"/>
+        </w:pict>
+      </w:r>
+    </w:p>
+    <w:bookmarkEnd w:id="34"/>
+    <w:bookmarkStart w:id="35" w:name="조사-기준"/>
+    <w:p>
+      <w:pPr>
+        <w:pStyle w:val="Heading2"/>
+      </w:pPr>
+      <w:r>
+        <w:t xml:space="preserve">14. 조사 기준</w:t>
       </w:r>
     </w:p>
     <w:p>
@@ -3655,8 +4960,8 @@
         <w:t xml:space="preserve">https://wikidocs.net/346435</w:t>
       </w:r>
     </w:p>
-    <w:bookmarkEnd w:id="31"/>
-    <w:bookmarkEnd w:id="32"/>
+    <w:bookmarkEnd w:id="35"/>
+    <w:bookmarkEnd w:id="36"/>
     <w:sectPr>
       <w:footnotePr>
         <w:numRestart w:val="eachSect"/>

</xml_diff>